<commit_message>
changes on responsivity ,  service claims chatbot , voice , anserws,
</commit_message>
<xml_diff>
--- a/frontend/Fragmento-content-review-used-en-de.docx
+++ b/frontend/Fragmento-content-review-used-en-de.docx
@@ -12,7 +12,7 @@
     </w:p>
     <w:p>
       <w:r>
-        <w:t xml:space="preserve">Generated from frontend locale and service-claim content files. Total review rows: 987.</w:t>
+        <w:t xml:space="preserve">Generated from frontend locale and service-claim content files. Total review rows: 992.</w:t>
       </w:r>
     </w:p>
     <w:tbl>
@@ -143,17 +143,17 @@
           </w:tcPr>
           <w:p>
             <w:r>
-              <w:t xml:space="preserve">Click for more info.</w:t>
-            </w:r>
-          </w:p>
-        </w:tc>
-        <w:tc>
-          <w:tcPr>
-            <w:tcW w:w="2400" w:type="dxa"/>
-          </w:tcPr>
-          <w:p>
-            <w:r>
-              <w:t xml:space="preserve">Mehr Infos per Klick.</w:t>
+              <w:t xml:space="preserve">Show more information.</w:t>
+            </w:r>
+          </w:p>
+        </w:tc>
+        <w:tc>
+          <w:tcPr>
+            <w:tcW w:w="2400" w:type="dxa"/>
+          </w:tcPr>
+          <w:p>
+            <w:r>
+              <w:t xml:space="preserve">Mehr Informationen anzeigen</w:t>
             </w:r>
           </w:p>
         </w:tc>
@@ -615,7 +615,7 @@
           </w:tcPr>
           <w:p>
             <w:r>
-              <w:t xml:space="preserve">Gib Vertragsnummer, Straße, Land, Stadt und PLZ vor der Verifizierung ein.</w:t>
+              <w:t xml:space="preserve">Gib Vertragsnummer, Straße, Land, Stadt und PLZ vor der Prüfung ein.</w:t>
             </w:r>
           </w:p>
         </w:tc>
@@ -783,7 +783,7 @@
           </w:tcPr>
           <w:p>
             <w:r>
-              <w:t xml:space="preserve">Adresse wird verifiziert...</w:t>
+              <w:t xml:space="preserve">Adresse wird geprüft...</w:t>
             </w:r>
           </w:p>
         </w:tc>
@@ -2369,17 +2369,21 @@
           </w:tcPr>
           <w:p>
             <w:r>
-              <w:t xml:space="preserve">Components and options</w:t>
-            </w:r>
-          </w:p>
-        </w:tc>
-        <w:tc>
-          <w:tcPr>
-            <w:tcW w:w="2400" w:type="dxa"/>
-          </w:tcPr>
-          <w:p>
-            <w:r>
-              <w:t xml:space="preserve">Bauteile und Optionen</w:t>
+              <w:t xml:space="preserve">
+                Additional items for your
+                <w:br/>
+                built-in kitchen
+              </w:t>
+            </w:r>
+          </w:p>
+        </w:tc>
+        <w:tc>
+          <w:tcPr>
+            <w:tcW w:w="2400" w:type="dxa"/>
+          </w:tcPr>
+          <w:p>
+            <w:r>
+              <w:t xml:space="preserve">Ergänzungsartikel zu deiner individuellen Einbauküche</w:t>
             </w:r>
           </w:p>
         </w:tc>
@@ -2495,17 +2499,17 @@
           </w:tcPr>
           <w:p>
             <w:r>
-              <w:t xml:space="preserve">Configure your kitchen directly from the current catalog.</w:t>
-            </w:r>
-          </w:p>
-        </w:tc>
-        <w:tc>
-          <w:tcPr>
-            <w:tcW w:w="2400" w:type="dxa"/>
-          </w:tcPr>
-          <w:p>
-            <w:r>
-              <w:t xml:space="preserve">Konfiguriere deine Küche direkt aus dem aktuellen Katalog.</w:t>
+              <w:t xml:space="preserve">Choose additional items for your built-in kitchen.</w:t>
+            </w:r>
+          </w:p>
+        </w:tc>
+        <w:tc>
+          <w:tcPr>
+            <w:tcW w:w="2400" w:type="dxa"/>
+          </w:tcPr>
+          <w:p>
+            <w:r>
+              <w:t xml:space="preserve">Suchen Sie sich die Ergänzungsartikel für Ihre Einbauküche aus.</w:t>
             </w:r>
           </w:p>
         </w:tc>
@@ -2537,17 +2541,17 @@
           </w:tcPr>
           <w:p>
             <w:r>
-              <w:t xml:space="preserve">Your kitchen</w:t>
-            </w:r>
-          </w:p>
-        </w:tc>
-        <w:tc>
-          <w:tcPr>
-            <w:tcW w:w="2400" w:type="dxa"/>
-          </w:tcPr>
-          <w:p>
-            <w:r>
-              <w:t xml:space="preserve">Deine Küche</w:t>
+              <w:t xml:space="preserve">Your individual built-in kitchen</w:t>
+            </w:r>
+          </w:p>
+        </w:tc>
+        <w:tc>
+          <w:tcPr>
+            <w:tcW w:w="2400" w:type="dxa"/>
+          </w:tcPr>
+          <w:p>
+            <w:r>
+              <w:t xml:space="preserve">Deine individuelle Einbauküche</w:t>
             </w:r>
           </w:p>
         </w:tc>
@@ -2653,6 +2657,48 @@
           </w:tcPr>
           <w:p>
             <w:r>
+              <w:t xml:space="preserve">configurator.photoButtonLabel</w:t>
+            </w:r>
+          </w:p>
+        </w:tc>
+        <w:tc>
+          <w:tcPr>
+            <w:tcW w:w="2400" w:type="dxa"/>
+          </w:tcPr>
+          <w:p>
+            <w:r>
+              <w:t xml:space="preserve">Photo</w:t>
+            </w:r>
+          </w:p>
+        </w:tc>
+        <w:tc>
+          <w:tcPr>
+            <w:tcW w:w="2400" w:type="dxa"/>
+          </w:tcPr>
+          <w:p>
+            <w:r>
+              <w:t xml:space="preserve">Foto</w:t>
+            </w:r>
+          </w:p>
+        </w:tc>
+      </w:tr>
+      <w:tr>
+        <w:tc>
+          <w:tcPr>
+            <w:tcW w:w="2400" w:type="dxa"/>
+          </w:tcPr>
+          <w:p>
+            <w:r>
+              <w:t xml:space="preserve">Public site locale</w:t>
+            </w:r>
+          </w:p>
+        </w:tc>
+        <w:tc>
+          <w:tcPr>
+            <w:tcW w:w="2400" w:type="dxa"/>
+          </w:tcPr>
+          <w:p>
+            <w:r>
               <w:t xml:space="preserve">configurator.productAssistantActiveContext</w:t>
             </w:r>
           </w:p>
@@ -3083,17 +3129,17 @@
           </w:tcPr>
           <w:p>
             <w:r>
-              <w:t xml:space="preserve">The request is taking too long. Please try again.</w:t>
-            </w:r>
-          </w:p>
-        </w:tc>
-        <w:tc>
-          <w:tcPr>
-            <w:tcW w:w="2400" w:type="dxa"/>
-          </w:tcPr>
-          <w:p>
-            <w:r>
-              <w:t xml:space="preserve">Die Anfrage dauert zu lange. Bitte versuchen Sie es erneut.</w:t>
+              <w:t xml:space="preserve">This is taking too long. Please try again.</w:t>
+            </w:r>
+          </w:p>
+        </w:tc>
+        <w:tc>
+          <w:tcPr>
+            <w:tcW w:w="2400" w:type="dxa"/>
+          </w:tcPr>
+          <w:p>
+            <w:r>
+              <w:t xml:space="preserve">Das dauert gerade zu lange. Bitte versuche es erneut.</w:t>
             </w:r>
           </w:p>
         </w:tc>
@@ -3125,17 +3171,17 @@
           </w:tcPr>
           <w:p>
             <w:r>
-              <w:t xml:space="preserve">The product question could not be answered.</w:t>
-            </w:r>
-          </w:p>
-        </w:tc>
-        <w:tc>
-          <w:tcPr>
-            <w:tcW w:w="2400" w:type="dxa"/>
-          </w:tcPr>
-          <w:p>
-            <w:r>
-              <w:t xml:space="preserve">Die Produktfrage konnte nicht beantwortet werden.</w:t>
+              <w:t xml:space="preserve">I couldn't answer that product question. Please try again.</w:t>
+            </w:r>
+          </w:p>
+        </w:tc>
+        <w:tc>
+          <w:tcPr>
+            <w:tcW w:w="2400" w:type="dxa"/>
+          </w:tcPr>
+          <w:p>
+            <w:r>
+              <w:t xml:space="preserve">Die Frage konnte leider nicht beantwortet werden. Bitte versuche es erneut.</w:t>
             </w:r>
           </w:p>
         </w:tc>
@@ -5267,17 +5313,17 @@
           </w:tcPr>
           <w:p>
             <w:r>
-              <w:t xml:space="preserve">Interactive kitchen view</w:t>
-            </w:r>
-          </w:p>
-        </w:tc>
-        <w:tc>
-          <w:tcPr>
-            <w:tcW w:w="2400" w:type="dxa"/>
-          </w:tcPr>
-          <w:p>
-            <w:r>
-              <w:t xml:space="preserve">Interaktive Küchenansicht</w:t>
+              <w:t xml:space="preserve">Plan your individual kitchen</w:t>
+            </w:r>
+          </w:p>
+        </w:tc>
+        <w:tc>
+          <w:tcPr>
+            <w:tcW w:w="2400" w:type="dxa"/>
+          </w:tcPr>
+          <w:p>
+            <w:r>
+              <w:t xml:space="preserve">Plane deine individuelle Küche</w:t>
             </w:r>
           </w:p>
         </w:tc>
@@ -5341,6 +5387,48 @@
           </w:tcPr>
           <w:p>
             <w:r>
+              <w:t xml:space="preserve">configurator.statusConfirmTerms</w:t>
+            </w:r>
+          </w:p>
+        </w:tc>
+        <w:tc>
+          <w:tcPr>
+            <w:tcW w:w="2400" w:type="dxa"/>
+          </w:tcPr>
+          <w:p>
+            <w:r>
+              <w:t xml:space="preserve">Please confirm that you have read and accept the terms and conditions.</w:t>
+            </w:r>
+          </w:p>
+        </w:tc>
+        <w:tc>
+          <w:tcPr>
+            <w:tcW w:w="2400" w:type="dxa"/>
+          </w:tcPr>
+          <w:p>
+            <w:r>
+              <w:t xml:space="preserve">Bitte bestätige, dass du die AGBs gelesen hast und zustimmst.</w:t>
+            </w:r>
+          </w:p>
+        </w:tc>
+      </w:tr>
+      <w:tr>
+        <w:tc>
+          <w:tcPr>
+            <w:tcW w:w="2400" w:type="dxa"/>
+          </w:tcPr>
+          <w:p>
+            <w:r>
+              <w:t xml:space="preserve">Public site locale</w:t>
+            </w:r>
+          </w:p>
+        </w:tc>
+        <w:tc>
+          <w:tcPr>
+            <w:tcW w:w="2400" w:type="dxa"/>
+          </w:tcPr>
+          <w:p>
+            <w:r>
               <w:t xml:space="preserve">configurator.statusSaveFailed</w:t>
             </w:r>
           </w:p>
@@ -5613,7 +5701,7 @@
           </w:tcPr>
           <w:p>
             <w:r>
-              <w:t xml:space="preserve">Bitte verifiziere die Adresse vor dem Einreichen der Bestellung.</w:t>
+              <w:t xml:space="preserve">Bitte prüfe die Adresse vor dem Absenden der Bestellung.</w:t>
             </w:r>
           </w:p>
         </w:tc>
@@ -7585,17 +7673,17 @@
           </w:tcPr>
           <w:p>
             <w:r>
-              <w:t xml:space="preserve">I agree to the processing of my data for the purpose of this order.*</w:t>
-            </w:r>
-          </w:p>
-        </w:tc>
-        <w:tc>
-          <w:tcPr>
-            <w:tcW w:w="2400" w:type="dxa"/>
-          </w:tcPr>
-          <w:p>
-            <w:r>
-              <w:t xml:space="preserve">Ich stimme der Verarbeitung meiner Daten zum Zweck der Bestellung zu.*</w:t>
+              <w:t xml:space="preserve">I have read the privacy policy and confirm that my order data may be used to process this order.*</w:t>
+            </w:r>
+          </w:p>
+        </w:tc>
+        <w:tc>
+          <w:tcPr>
+            <w:tcW w:w="2400" w:type="dxa"/>
+          </w:tcPr>
+          <w:p>
+            <w:r>
+              <w:t xml:space="preserve">Ich habe die Datenschutzerklärung gelesen und bestätige, dass meine Bestelldaten zur Bearbeitung dieser Bestellung verwendet werden dürfen.*</w:t>
             </w:r>
           </w:p>
         </w:tc>
@@ -7617,6 +7705,174 @@
           </w:tcPr>
           <w:p>
             <w:r>
+              <w:t xml:space="preserve">order.consentPrefix</w:t>
+            </w:r>
+          </w:p>
+        </w:tc>
+        <w:tc>
+          <w:tcPr>
+            <w:tcW w:w="2400" w:type="dxa"/>
+          </w:tcPr>
+          <w:p>
+            <w:r>
+              <w:t xml:space="preserve">I have read the </w:t>
+            </w:r>
+          </w:p>
+        </w:tc>
+        <w:tc>
+          <w:tcPr>
+            <w:tcW w:w="2400" w:type="dxa"/>
+          </w:tcPr>
+          <w:p>
+            <w:r>
+              <w:t xml:space="preserve">Ich habe die </w:t>
+            </w:r>
+          </w:p>
+        </w:tc>
+      </w:tr>
+      <w:tr>
+        <w:tc>
+          <w:tcPr>
+            <w:tcW w:w="2400" w:type="dxa"/>
+          </w:tcPr>
+          <w:p>
+            <w:r>
+              <w:t xml:space="preserve">Public site locale</w:t>
+            </w:r>
+          </w:p>
+        </w:tc>
+        <w:tc>
+          <w:tcPr>
+            <w:tcW w:w="2400" w:type="dxa"/>
+          </w:tcPr>
+          <w:p>
+            <w:r>
+              <w:t xml:space="preserve">order.consentShortPrefix</w:t>
+            </w:r>
+          </w:p>
+        </w:tc>
+        <w:tc>
+          <w:tcPr>
+            <w:tcW w:w="2400" w:type="dxa"/>
+          </w:tcPr>
+          <w:p>
+            <w:r>
+              <w:t xml:space="preserve">I accept the </w:t>
+            </w:r>
+          </w:p>
+        </w:tc>
+        <w:tc>
+          <w:tcPr>
+            <w:tcW w:w="2400" w:type="dxa"/>
+          </w:tcPr>
+          <w:p>
+            <w:r>
+              <w:t xml:space="preserve">Ich stimme der </w:t>
+            </w:r>
+          </w:p>
+        </w:tc>
+      </w:tr>
+      <w:tr>
+        <w:tc>
+          <w:tcPr>
+            <w:tcW w:w="2400" w:type="dxa"/>
+          </w:tcPr>
+          <w:p>
+            <w:r>
+              <w:t xml:space="preserve">Public site locale</w:t>
+            </w:r>
+          </w:p>
+        </w:tc>
+        <w:tc>
+          <w:tcPr>
+            <w:tcW w:w="2400" w:type="dxa"/>
+          </w:tcPr>
+          <w:p>
+            <w:r>
+              <w:t xml:space="preserve">order.consentShortSuffix</w:t>
+            </w:r>
+          </w:p>
+        </w:tc>
+        <w:tc>
+          <w:tcPr>
+            <w:tcW w:w="2400" w:type="dxa"/>
+          </w:tcPr>
+          <w:p>
+            <w:r>
+              <w:t xml:space="preserve">.*</w:t>
+            </w:r>
+          </w:p>
+        </w:tc>
+        <w:tc>
+          <w:tcPr>
+            <w:tcW w:w="2400" w:type="dxa"/>
+          </w:tcPr>
+          <w:p>
+            <w:r>
+              <w:t xml:space="preserve"> zu.*</w:t>
+            </w:r>
+          </w:p>
+        </w:tc>
+      </w:tr>
+      <w:tr>
+        <w:tc>
+          <w:tcPr>
+            <w:tcW w:w="2400" w:type="dxa"/>
+          </w:tcPr>
+          <w:p>
+            <w:r>
+              <w:t xml:space="preserve">Public site locale</w:t>
+            </w:r>
+          </w:p>
+        </w:tc>
+        <w:tc>
+          <w:tcPr>
+            <w:tcW w:w="2400" w:type="dxa"/>
+          </w:tcPr>
+          <w:p>
+            <w:r>
+              <w:t xml:space="preserve">order.consentSuffix</w:t>
+            </w:r>
+          </w:p>
+        </w:tc>
+        <w:tc>
+          <w:tcPr>
+            <w:tcW w:w="2400" w:type="dxa"/>
+          </w:tcPr>
+          <w:p>
+            <w:r>
+              <w:t xml:space="preserve"> and confirm that my order data may be used to process this order.*</w:t>
+            </w:r>
+          </w:p>
+        </w:tc>
+        <w:tc>
+          <w:tcPr>
+            <w:tcW w:w="2400" w:type="dxa"/>
+          </w:tcPr>
+          <w:p>
+            <w:r>
+              <w:t xml:space="preserve"> gelesen und bestätige, dass meine Bestelldaten zur Bearbeitung dieser Bestellung verwendet werden dürfen.*</w:t>
+            </w:r>
+          </w:p>
+        </w:tc>
+      </w:tr>
+      <w:tr>
+        <w:tc>
+          <w:tcPr>
+            <w:tcW w:w="2400" w:type="dxa"/>
+          </w:tcPr>
+          <w:p>
+            <w:r>
+              <w:t xml:space="preserve">Public site locale</w:t>
+            </w:r>
+          </w:p>
+        </w:tc>
+        <w:tc>
+          <w:tcPr>
+            <w:tcW w:w="2400" w:type="dxa"/>
+          </w:tcPr>
+          <w:p>
+            <w:r>
               <w:t xml:space="preserve">order.contactPersonHelp</w:t>
             </w:r>
           </w:p>
@@ -7763,7 +8019,7 @@
           </w:tcPr>
           <w:p>
             <w:r>
-              <w:t xml:space="preserve">Korrigiere die Adressdaten und starte die Verifizierung erneut.</w:t>
+              <w:t xml:space="preserve">Korrigiere die Adressdaten und starte die Prüfung erneut.</w:t>
             </w:r>
           </w:p>
         </w:tc>
@@ -8289,6 +8545,48 @@
           </w:tcPr>
           <w:p>
             <w:r>
+              <w:t xml:space="preserve">order.fieldErrors.termsConsent</w:t>
+            </w:r>
+          </w:p>
+        </w:tc>
+        <w:tc>
+          <w:tcPr>
+            <w:tcW w:w="2400" w:type="dxa"/>
+          </w:tcPr>
+          <w:p>
+            <w:r>
+              <w:t xml:space="preserve">Please accept the terms and conditions.</w:t>
+            </w:r>
+          </w:p>
+        </w:tc>
+        <w:tc>
+          <w:tcPr>
+            <w:tcW w:w="2400" w:type="dxa"/>
+          </w:tcPr>
+          <w:p>
+            <w:r>
+              <w:t xml:space="preserve">Bitte den AGBs zustimmen.</w:t>
+            </w:r>
+          </w:p>
+        </w:tc>
+      </w:tr>
+      <w:tr>
+        <w:tc>
+          <w:tcPr>
+            <w:tcW w:w="2400" w:type="dxa"/>
+          </w:tcPr>
+          <w:p>
+            <w:r>
+              <w:t xml:space="preserve">Public site locale</w:t>
+            </w:r>
+          </w:p>
+        </w:tc>
+        <w:tc>
+          <w:tcPr>
+            <w:tcW w:w="2400" w:type="dxa"/>
+          </w:tcPr>
+          <w:p>
+            <w:r>
               <w:t xml:space="preserve">order.fieldRequired</w:t>
             </w:r>
           </w:p>
@@ -8593,17 +8891,17 @@
           </w:tcPr>
           <w:p>
             <w:r>
-              <w:t xml:space="preserve">Choose a payment method, leave optional notes, and confirm data privacy consent.</w:t>
-            </w:r>
-          </w:p>
-        </w:tc>
-        <w:tc>
-          <w:tcPr>
-            <w:tcW w:w="2400" w:type="dxa"/>
-          </w:tcPr>
-          <w:p>
-            <w:r>
-              <w:t xml:space="preserve">Wähle eine Zahlungsmethode, hinterlasse optional Hinweise und bestätige den Datenschutz.</w:t>
+              <w:t xml:space="preserve">Add delivery details if needed, then confirm the privacy notice.</w:t>
+            </w:r>
+          </w:p>
+        </w:tc>
+        <w:tc>
+          <w:tcPr>
+            <w:tcW w:w="2400" w:type="dxa"/>
+          </w:tcPr>
+          <w:p>
+            <w:r>
+              <w:t xml:space="preserve">Ergänze bei Bedarf Lieferdetails und bestätige den Datenschutzhinweis.</w:t>
             </w:r>
           </w:p>
         </w:tc>
@@ -8635,17 +8933,17 @@
           </w:tcPr>
           <w:p>
             <w:r>
-              <w:t xml:space="preserve">Payment + consent</w:t>
-            </w:r>
-          </w:p>
-        </w:tc>
-        <w:tc>
-          <w:tcPr>
-            <w:tcW w:w="2400" w:type="dxa"/>
-          </w:tcPr>
-          <w:p>
-            <w:r>
-              <w:t xml:space="preserve">Zahlung + Einwilligung</w:t>
+              <w:t xml:space="preserve">Order notes</w:t>
+            </w:r>
+          </w:p>
+        </w:tc>
+        <w:tc>
+          <w:tcPr>
+            <w:tcW w:w="2400" w:type="dxa"/>
+          </w:tcPr>
+          <w:p>
+            <w:r>
+              <w:t xml:space="preserve">Bestellhinweise</w:t>
             </w:r>
           </w:p>
         </w:tc>
@@ -8793,6 +9091,90 @@
           </w:tcPr>
           <w:p>
             <w:r>
+              <w:t xml:space="preserve">order.privacyPolicy</w:t>
+            </w:r>
+          </w:p>
+        </w:tc>
+        <w:tc>
+          <w:tcPr>
+            <w:tcW w:w="2400" w:type="dxa"/>
+          </w:tcPr>
+          <w:p>
+            <w:r>
+              <w:t xml:space="preserve">privacy policy</w:t>
+            </w:r>
+          </w:p>
+        </w:tc>
+        <w:tc>
+          <w:tcPr>
+            <w:tcW w:w="2400" w:type="dxa"/>
+          </w:tcPr>
+          <w:p>
+            <w:r>
+              <w:t xml:space="preserve">Datenschutzerklärung</w:t>
+            </w:r>
+          </w:p>
+        </w:tc>
+      </w:tr>
+      <w:tr>
+        <w:tc>
+          <w:tcPr>
+            <w:tcW w:w="2400" w:type="dxa"/>
+          </w:tcPr>
+          <w:p>
+            <w:r>
+              <w:t xml:space="preserve">Public site locale</w:t>
+            </w:r>
+          </w:p>
+        </w:tc>
+        <w:tc>
+          <w:tcPr>
+            <w:tcW w:w="2400" w:type="dxa"/>
+          </w:tcPr>
+          <w:p>
+            <w:r>
+              <w:t xml:space="preserve">order.privacyPolicyPending</w:t>
+            </w:r>
+          </w:p>
+        </w:tc>
+        <w:tc>
+          <w:tcPr>
+            <w:tcW w:w="2400" w:type="dxa"/>
+          </w:tcPr>
+          <w:p>
+            <w:r>
+              <w:t xml:space="preserve">Privacy policy will be available soon.</w:t>
+            </w:r>
+          </w:p>
+        </w:tc>
+        <w:tc>
+          <w:tcPr>
+            <w:tcW w:w="2400" w:type="dxa"/>
+          </w:tcPr>
+          <w:p>
+            <w:r>
+              <w:t xml:space="preserve">Die Datenschutzerklärung ist bald verfügbar.</w:t>
+            </w:r>
+          </w:p>
+        </w:tc>
+      </w:tr>
+      <w:tr>
+        <w:tc>
+          <w:tcPr>
+            <w:tcW w:w="2400" w:type="dxa"/>
+          </w:tcPr>
+          <w:p>
+            <w:r>
+              <w:t xml:space="preserve">Public site locale</w:t>
+            </w:r>
+          </w:p>
+        </w:tc>
+        <w:tc>
+          <w:tcPr>
+            <w:tcW w:w="2400" w:type="dxa"/>
+          </w:tcPr>
+          <w:p>
+            <w:r>
               <w:t xml:space="preserve">order.requiredHint</w:t>
             </w:r>
           </w:p>
@@ -8855,7 +9237,7 @@
           </w:tcPr>
           <w:p>
             <w:r>
-              <w:t xml:space="preserve">Bitte prüfe die Straßenangaben und verifiziere bei Bedarf erneut.</w:t>
+              <w:t xml:space="preserve">Bitte prüfe die Straßenangaben und starte die Prüfung bei Bedarf erneut.</w:t>
             </w:r>
           </w:p>
         </w:tc>
@@ -9307,17 +9689,17 @@
           </w:tcPr>
           <w:p>
             <w:r>
-              <w:t xml:space="preserve">Submit order</w:t>
-            </w:r>
-          </w:p>
-        </w:tc>
-        <w:tc>
-          <w:tcPr>
-            <w:tcW w:w="2400" w:type="dxa"/>
-          </w:tcPr>
-          <w:p>
-            <w:r>
-              <w:t xml:space="preserve">Bestellung einreichen</w:t>
+              <w:t xml:space="preserve">Order with obligation to pay</w:t>
+            </w:r>
+          </w:p>
+        </w:tc>
+        <w:tc>
+          <w:tcPr>
+            <w:tcW w:w="2400" w:type="dxa"/>
+          </w:tcPr>
+          <w:p>
+            <w:r>
+              <w:t xml:space="preserve">Kostenpflichtig bestellen</w:t>
             </w:r>
           </w:p>
         </w:tc>
@@ -9423,6 +9805,132 @@
           </w:tcPr>
           <w:p>
             <w:r>
+              <w:t xml:space="preserve">order.termsAndConditions</w:t>
+            </w:r>
+          </w:p>
+        </w:tc>
+        <w:tc>
+          <w:tcPr>
+            <w:tcW w:w="2400" w:type="dxa"/>
+          </w:tcPr>
+          <w:p>
+            <w:r>
+              <w:t xml:space="preserve">terms and conditions</w:t>
+            </w:r>
+          </w:p>
+        </w:tc>
+        <w:tc>
+          <w:tcPr>
+            <w:tcW w:w="2400" w:type="dxa"/>
+          </w:tcPr>
+          <w:p>
+            <w:r>
+              <w:t xml:space="preserve">AGBs</w:t>
+            </w:r>
+          </w:p>
+        </w:tc>
+      </w:tr>
+      <w:tr>
+        <w:tc>
+          <w:tcPr>
+            <w:tcW w:w="2400" w:type="dxa"/>
+          </w:tcPr>
+          <w:p>
+            <w:r>
+              <w:t xml:space="preserve">Public site locale</w:t>
+            </w:r>
+          </w:p>
+        </w:tc>
+        <w:tc>
+          <w:tcPr>
+            <w:tcW w:w="2400" w:type="dxa"/>
+          </w:tcPr>
+          <w:p>
+            <w:r>
+              <w:t xml:space="preserve">order.termsConsentPrefix</w:t>
+            </w:r>
+          </w:p>
+        </w:tc>
+        <w:tc>
+          <w:tcPr>
+            <w:tcW w:w="2400" w:type="dxa"/>
+          </w:tcPr>
+          <w:p>
+            <w:r>
+              <w:t xml:space="preserve">I have read the </w:t>
+            </w:r>
+          </w:p>
+        </w:tc>
+        <w:tc>
+          <w:tcPr>
+            <w:tcW w:w="2400" w:type="dxa"/>
+          </w:tcPr>
+          <w:p>
+            <w:r>
+              <w:t xml:space="preserve">Ich habe die </w:t>
+            </w:r>
+          </w:p>
+        </w:tc>
+      </w:tr>
+      <w:tr>
+        <w:tc>
+          <w:tcPr>
+            <w:tcW w:w="2400" w:type="dxa"/>
+          </w:tcPr>
+          <w:p>
+            <w:r>
+              <w:t xml:space="preserve">Public site locale</w:t>
+            </w:r>
+          </w:p>
+        </w:tc>
+        <w:tc>
+          <w:tcPr>
+            <w:tcW w:w="2400" w:type="dxa"/>
+          </w:tcPr>
+          <w:p>
+            <w:r>
+              <w:t xml:space="preserve">order.termsConsentSuffix</w:t>
+            </w:r>
+          </w:p>
+        </w:tc>
+        <w:tc>
+          <w:tcPr>
+            <w:tcW w:w="2400" w:type="dxa"/>
+          </w:tcPr>
+          <w:p>
+            <w:r>
+              <w:t xml:space="preserve"> and agree.*</w:t>
+            </w:r>
+          </w:p>
+        </w:tc>
+        <w:tc>
+          <w:tcPr>
+            <w:tcW w:w="2400" w:type="dxa"/>
+          </w:tcPr>
+          <w:p>
+            <w:r>
+              <w:t xml:space="preserve"> gelesen und stimme zu.*</w:t>
+            </w:r>
+          </w:p>
+        </w:tc>
+      </w:tr>
+      <w:tr>
+        <w:tc>
+          <w:tcPr>
+            <w:tcW w:w="2400" w:type="dxa"/>
+          </w:tcPr>
+          <w:p>
+            <w:r>
+              <w:t xml:space="preserve">Public site locale</w:t>
+            </w:r>
+          </w:p>
+        </w:tc>
+        <w:tc>
+          <w:tcPr>
+            <w:tcW w:w="2400" w:type="dxa"/>
+          </w:tcPr>
+          <w:p>
+            <w:r>
               <w:t xml:space="preserve">order.title</w:t>
             </w:r>
           </w:p>
@@ -9569,7 +10077,7 @@
           </w:tcPr>
           <w:p>
             <w:r>
-              <w:t xml:space="preserve">Adresse verifizieren</w:t>
+              <w:t xml:space="preserve">Adresse prüfen</w:t>
             </w:r>
           </w:p>
         </w:tc>
@@ -9611,7 +10119,7 @@
           </w:tcPr>
           <w:p>
             <w:r>
-              <w:t xml:space="preserve">Bitte verifiziere die Adresse vor dem Absenden der Bestellung.</w:t>
+              <w:t xml:space="preserve">Bitte prüfe die Adresse vor dem Absenden der Bestellung.</w:t>
             </w:r>
           </w:p>
         </w:tc>
@@ -9653,7 +10161,7 @@
           </w:tcPr>
           <w:p>
             <w:r>
-              <w:t xml:space="preserve">Wird verifiziert...</w:t>
+              <w:t xml:space="preserve">Wird geprüft...</w:t>
             </w:r>
           </w:p>
         </w:tc>
@@ -10735,17 +11243,17 @@
           </w:tcPr>
           <w:p>
             <w:r>
-              <w:t xml:space="preserve">Contracts</w:t>
-            </w:r>
-          </w:p>
-        </w:tc>
-        <w:tc>
-          <w:tcPr>
-            <w:tcW w:w="2400" w:type="dxa"/>
-          </w:tcPr>
-          <w:p>
-            <w:r>
-              <w:t xml:space="preserve">Verträge</w:t>
+              <w:t xml:space="preserve">Contract numbers</w:t>
+            </w:r>
+          </w:p>
+        </w:tc>
+        <w:tc>
+          <w:tcPr>
+            <w:tcW w:w="2400" w:type="dxa"/>
+          </w:tcPr>
+          <w:p>
+            <w:r>
+              <w:t xml:space="preserve">Vertragsnummern</w:t>
             </w:r>
           </w:p>
         </w:tc>
@@ -11239,17 +11747,17 @@
           </w:tcPr>
           <w:p>
             <w:r>
-              <w:t xml:space="preserve">Modern editorial operations for kitchens and orders.</w:t>
-            </w:r>
-          </w:p>
-        </w:tc>
-        <w:tc>
-          <w:tcPr>
-            <w:tcW w:w="2400" w:type="dxa"/>
-          </w:tcPr>
-          <w:p>
-            <w:r>
-              <w:t xml:space="preserve">Moderne Verwaltung für Küchen und Bestellungen.</w:t>
+              <w:t xml:space="preserve">Kitchen catalog and order operations.</w:t>
+            </w:r>
+          </w:p>
+        </w:tc>
+        <w:tc>
+          <w:tcPr>
+            <w:tcW w:w="2400" w:type="dxa"/>
+          </w:tcPr>
+          <w:p>
+            <w:r>
+              <w:t xml:space="preserve">Katalog- und Bestellverwaltung für Küchen.</w:t>
             </w:r>
           </w:p>
         </w:tc>
@@ -11869,7 +12377,7 @@
           </w:tcPr>
           <w:p>
             <w:r>
-              <w:t xml:space="preserve">Back to claims</w:t>
+              <w:t xml:space="preserve">Back to service requests</w:t>
             </w:r>
           </w:p>
         </w:tc>
@@ -11953,7 +12461,7 @@
           </w:tcPr>
           <w:p>
             <w:r>
-              <w:t xml:space="preserve">Claim</w:t>
+              <w:t xml:space="preserve">Service request</w:t>
             </w:r>
           </w:p>
         </w:tc>
@@ -12005,7 +12513,7 @@
           </w:tcPr>
           <w:p>
             <w:r>
-              <w:t xml:space="preserve">Details aus der eingereichten Reklamationsanfrage.</w:t>
+              <w:t xml:space="preserve">Details aus der eingereichten Reklamation.</w:t>
             </w:r>
           </w:p>
         </w:tc>
@@ -12037,7 +12545,7 @@
           </w:tcPr>
           <w:p>
             <w:r>
-              <w:t xml:space="preserve">{count} claim matches the current filters.</w:t>
+              <w:t xml:space="preserve">{count} service request matches the current filters.</w:t>
             </w:r>
           </w:p>
         </w:tc>
@@ -12079,7 +12587,7 @@
           </w:tcPr>
           <w:p>
             <w:r>
-              <w:t xml:space="preserve">Claim not found</w:t>
+              <w:t xml:space="preserve">Service request not found</w:t>
             </w:r>
           </w:p>
         </w:tc>
@@ -12121,7 +12629,7 @@
           </w:tcPr>
           <w:p>
             <w:r>
-              <w:t xml:space="preserve">Claim {claimNumber}</w:t>
+              <w:t xml:space="preserve">Service request {claimNumber}</w:t>
             </w:r>
           </w:p>
         </w:tc>
@@ -12163,7 +12671,7 @@
           </w:tcPr>
           <w:p>
             <w:r>
-              <w:t xml:space="preserve">Claims</w:t>
+              <w:t xml:space="preserve">Service requests</w:t>
             </w:r>
           </w:p>
         </w:tc>
@@ -12205,7 +12713,7 @@
           </w:tcPr>
           <w:p>
             <w:r>
-              <w:t xml:space="preserve">{count} claims match the current filters.</w:t>
+              <w:t xml:space="preserve">{count} service requests match the current filters.</w:t>
             </w:r>
           </w:p>
         </w:tc>
@@ -12415,17 +12923,17 @@
           </w:tcPr>
           <w:p>
             <w:r>
-              <w:t xml:space="preserve">Contract</w:t>
-            </w:r>
-          </w:p>
-        </w:tc>
-        <w:tc>
-          <w:tcPr>
-            <w:tcW w:w="2400" w:type="dxa"/>
-          </w:tcPr>
-          <w:p>
-            <w:r>
-              <w:t xml:space="preserve">Vertrag</w:t>
+              <w:t xml:space="preserve">Contract number</w:t>
+            </w:r>
+          </w:p>
+        </w:tc>
+        <w:tc>
+          <w:tcPr>
+            <w:tcW w:w="2400" w:type="dxa"/>
+          </w:tcPr>
+          <w:p>
+            <w:r>
+              <w:t xml:space="preserve">Vertragsnummer</w:t>
             </w:r>
           </w:p>
         </w:tc>
@@ -12583,7 +13091,7 @@
           </w:tcPr>
           <w:p>
             <w:r>
-              <w:t xml:space="preserve">Delete claim</w:t>
+              <w:t xml:space="preserve">Delete service request</w:t>
             </w:r>
           </w:p>
         </w:tc>
@@ -12626,7 +13134,7 @@
           <w:p>
             <w:r>
               <w:t xml:space="preserve">
-                Delete this claim?
+                Delete this service request?
                 <w:br/>
                 This action cannot be undone.
               </w:t>
@@ -12759,17 +13267,17 @@
           </w:tcPr>
           <w:p>
             <w:r>
-              <w:t xml:space="preserve">Filter by customer, contract, product, issue, status, or date.</w:t>
-            </w:r>
-          </w:p>
-        </w:tc>
-        <w:tc>
-          <w:tcPr>
-            <w:tcW w:w="2400" w:type="dxa"/>
-          </w:tcPr>
-          <w:p>
-            <w:r>
-              <w:t xml:space="preserve">Nach Kunde, Vertrag, Artikel, Problem, Status oder Datum filtern.</w:t>
+              <w:t xml:space="preserve">Filter by customer, contract number, product, issue, status, or date.</w:t>
+            </w:r>
+          </w:p>
+        </w:tc>
+        <w:tc>
+          <w:tcPr>
+            <w:tcW w:w="2400" w:type="dxa"/>
+          </w:tcPr>
+          <w:p>
+            <w:r>
+              <w:t xml:space="preserve">Nach Kunde, Vertragsnummer, Artikel, Problem, Status oder Datum filtern.</w:t>
             </w:r>
           </w:p>
         </w:tc>
@@ -13137,7 +13645,7 @@
           </w:tcPr>
           <w:p>
             <w:r>
-              <w:t xml:space="preserve">No claims found.</w:t>
+              <w:t xml:space="preserve">No service requests found.</w:t>
             </w:r>
           </w:p>
         </w:tc>
@@ -13315,7 +13823,7 @@
           </w:tcPr>
           <w:p>
             <w:r>
-              <w:t xml:space="preserve">Diese Datei konnte nicht geladen werden. Verwenden Sie stattdessen Herunterladen.</w:t>
+              <w:t xml:space="preserve">Diese Datei konnte nicht geladen werden. Verwenden Sie stattdessen "Herunterladen".</w:t>
             </w:r>
           </w:p>
         </w:tc>
@@ -13399,7 +13907,7 @@
           </w:tcPr>
           <w:p>
             <w:r>
-              <w:t xml:space="preserve">Für diesen Dateityp gibt es keine Vorschau auf der Seite. Verwenden Sie Herunterladen, um die Datei zu öffnen.</w:t>
+              <w:t xml:space="preserve">Für diesen Dateityp gibt es keine Vorschau auf der Seite. Verwenden Sie "Herunterladen", um die Datei zu öffnen.</w:t>
             </w:r>
           </w:p>
         </w:tc>
@@ -13441,7 +13949,7 @@
           </w:tcPr>
           <w:p>
             <w:r>
-              <w:t xml:space="preserve">Anfragedetails</w:t>
+              <w:t xml:space="preserve">Details</w:t>
             </w:r>
           </w:p>
         </w:tc>
@@ -13515,7 +14023,7 @@
           </w:tcPr>
           <w:p>
             <w:r>
-              <w:t xml:space="preserve">The requested claim does not exist.</w:t>
+              <w:t xml:space="preserve">The requested service request does not exist.</w:t>
             </w:r>
           </w:p>
         </w:tc>
@@ -13557,17 +14065,17 @@
           </w:tcPr>
           <w:p>
             <w:r>
-              <w:t xml:space="preserve">Search by contract, name, phone, email, issue...</w:t>
-            </w:r>
-          </w:p>
-        </w:tc>
-        <w:tc>
-          <w:tcPr>
-            <w:tcW w:w="2400" w:type="dxa"/>
-          </w:tcPr>
-          <w:p>
-            <w:r>
-              <w:t xml:space="preserve">Nach Vertrag, Name, Telefon, E-Mail, Problem suchen...</w:t>
+              <w:t xml:space="preserve">Search by contract number, name, phone, email, issue...</w:t>
+            </w:r>
+          </w:p>
+        </w:tc>
+        <w:tc>
+          <w:tcPr>
+            <w:tcW w:w="2400" w:type="dxa"/>
+          </w:tcPr>
+          <w:p>
+            <w:r>
+              <w:t xml:space="preserve">Nach Vertragsnummer, Name, Telefon, E-Mail, Problem suchen...</w:t>
             </w:r>
           </w:p>
         </w:tc>
@@ -15447,7 +15955,7 @@
           </w:tcPr>
           <w:p>
             <w:r>
-              <w:t xml:space="preserve">Add Contract Number</w:t>
+              <w:t xml:space="preserve">Add contract number</w:t>
             </w:r>
           </w:p>
         </w:tc>
@@ -15825,7 +16333,7 @@
           </w:tcPr>
           <w:p>
             <w:r>
-              <w:t xml:space="preserve">Contract Numbers</w:t>
+              <w:t xml:space="preserve">Configured contract numbers</w:t>
             </w:r>
           </w:p>
         </w:tc>
@@ -15909,17 +16417,17 @@
           </w:tcPr>
           <w:p>
             <w:r>
-              <w:t xml:space="preserve">Contract</w:t>
-            </w:r>
-          </w:p>
-        </w:tc>
-        <w:tc>
-          <w:tcPr>
-            <w:tcW w:w="2400" w:type="dxa"/>
-          </w:tcPr>
-          <w:p>
-            <w:r>
-              <w:t xml:space="preserve">Vertrag</w:t>
+              <w:t xml:space="preserve">Contract number</w:t>
+            </w:r>
+          </w:p>
+        </w:tc>
+        <w:tc>
+          <w:tcPr>
+            <w:tcW w:w="2400" w:type="dxa"/>
+          </w:tcPr>
+          <w:p>
+            <w:r>
+              <w:t xml:space="preserve">Vertragsnummer</w:t>
             </w:r>
           </w:p>
         </w:tc>
@@ -15951,17 +16459,17 @@
           </w:tcPr>
           <w:p>
             <w:r>
-              <w:t xml:space="preserve">Contract address</w:t>
-            </w:r>
-          </w:p>
-        </w:tc>
-        <w:tc>
-          <w:tcPr>
-            <w:tcW w:w="2400" w:type="dxa"/>
-          </w:tcPr>
-          <w:p>
-            <w:r>
-              <w:t xml:space="preserve">Vertragsadresse</w:t>
+              <w:t xml:space="preserve">Property address</w:t>
+            </w:r>
+          </w:p>
+        </w:tc>
+        <w:tc>
+          <w:tcPr>
+            <w:tcW w:w="2400" w:type="dxa"/>
+          </w:tcPr>
+          <w:p>
+            <w:r>
+              <w:t xml:space="preserve">Objektadresse</w:t>
             </w:r>
           </w:p>
         </w:tc>
@@ -16077,7 +16585,7 @@
           </w:tcPr>
           <w:p>
             <w:r>
-              <w:t xml:space="preserve">Contract Numbers</w:t>
+              <w:t xml:space="preserve">Contract numbers</w:t>
             </w:r>
           </w:p>
         </w:tc>
@@ -16497,17 +17005,17 @@
           </w:tcPr>
           <w:p>
             <w:r>
-              <w:t xml:space="preserve">Edit contract details</w:t>
-            </w:r>
-          </w:p>
-        </w:tc>
-        <w:tc>
-          <w:tcPr>
-            <w:tcW w:w="2400" w:type="dxa"/>
-          </w:tcPr>
-          <w:p>
-            <w:r>
-              <w:t xml:space="preserve">Vertragsdetails bearbeiten</w:t>
+              <w:t xml:space="preserve">Edit contract number details</w:t>
+            </w:r>
+          </w:p>
+        </w:tc>
+        <w:tc>
+          <w:tcPr>
+            <w:tcW w:w="2400" w:type="dxa"/>
+          </w:tcPr>
+          <w:p>
+            <w:r>
+              <w:t xml:space="preserve">Details der Vertragsnummer bearbeiten</w:t>
             </w:r>
           </w:p>
         </w:tc>
@@ -16539,17 +17047,17 @@
           </w:tcPr>
           <w:p>
             <w:r>
-              <w:t xml:space="preserve">Edit contract details for</w:t>
-            </w:r>
-          </w:p>
-        </w:tc>
-        <w:tc>
-          <w:tcPr>
-            <w:tcW w:w="2400" w:type="dxa"/>
-          </w:tcPr>
-          <w:p>
-            <w:r>
-              <w:t xml:space="preserve">Vertragsdetails bearbeiten für</w:t>
+              <w:t xml:space="preserve">Edit contract number details for</w:t>
+            </w:r>
+          </w:p>
+        </w:tc>
+        <w:tc>
+          <w:tcPr>
+            <w:tcW w:w="2400" w:type="dxa"/>
+          </w:tcPr>
+          <w:p>
+            <w:r>
+              <w:t xml:space="preserve">Details bearbeiten für</w:t>
             </w:r>
           </w:p>
         </w:tc>
@@ -16581,17 +17089,17 @@
           </w:tcPr>
           <w:p>
             <w:r>
-              <w:t xml:space="preserve">Edit contract details for {contractNumber}</w:t>
-            </w:r>
-          </w:p>
-        </w:tc>
-        <w:tc>
-          <w:tcPr>
-            <w:tcW w:w="2400" w:type="dxa"/>
-          </w:tcPr>
-          <w:p>
-            <w:r>
-              <w:t xml:space="preserve">Vertragsdetails für {contractNumber} bearbeiten</w:t>
+              <w:t xml:space="preserve">Edit contract number details for {contractNumber}</w:t>
+            </w:r>
+          </w:p>
+        </w:tc>
+        <w:tc>
+          <w:tcPr>
+            <w:tcW w:w="2400" w:type="dxa"/>
+          </w:tcPr>
+          <w:p>
+            <w:r>
+              <w:t xml:space="preserve">Details für Vertragsnummer {contractNumber} bearbeiten</w:t>
             </w:r>
           </w:p>
         </w:tc>
@@ -16833,17 +17341,17 @@
           </w:tcPr>
           <w:p>
             <w:r>
-              <w:t xml:space="preserve">Narrow the contract list below</w:t>
-            </w:r>
-          </w:p>
-        </w:tc>
-        <w:tc>
-          <w:tcPr>
-            <w:tcW w:w="2400" w:type="dxa"/>
-          </w:tcPr>
-          <w:p>
-            <w:r>
-              <w:t xml:space="preserve">Vertragsliste unten eingrenzen</w:t>
+              <w:t xml:space="preserve">Refine the contract number list below</w:t>
+            </w:r>
+          </w:p>
+        </w:tc>
+        <w:tc>
+          <w:tcPr>
+            <w:tcW w:w="2400" w:type="dxa"/>
+          </w:tcPr>
+          <w:p>
+            <w:r>
+              <w:t xml:space="preserve">Liste der Vertragsnummern eingrenzen</w:t>
             </w:r>
           </w:p>
         </w:tc>
@@ -16917,17 +17425,17 @@
           </w:tcPr>
           <w:p>
             <w:r>
-              <w:t xml:space="preserve">No contract address</w:t>
-            </w:r>
-          </w:p>
-        </w:tc>
-        <w:tc>
-          <w:tcPr>
-            <w:tcW w:w="2400" w:type="dxa"/>
-          </w:tcPr>
-          <w:p>
-            <w:r>
-              <w:t xml:space="preserve">Keine Vertragsadresse</w:t>
+              <w:t xml:space="preserve">No property address</w:t>
+            </w:r>
+          </w:p>
+        </w:tc>
+        <w:tc>
+          <w:tcPr>
+            <w:tcW w:w="2400" w:type="dxa"/>
+          </w:tcPr>
+          <w:p>
+            <w:r>
+              <w:t xml:space="preserve">Keine Objektadresse</w:t>
             </w:r>
           </w:p>
         </w:tc>
@@ -17127,17 +17635,17 @@
           </w:tcPr>
           <w:p>
             <w:r>
-              <w:t xml:space="preserve">No orders for this contract yet.</w:t>
-            </w:r>
-          </w:p>
-        </w:tc>
-        <w:tc>
-          <w:tcPr>
-            <w:tcW w:w="2400" w:type="dxa"/>
-          </w:tcPr>
-          <w:p>
-            <w:r>
-              <w:t xml:space="preserve">Für diesen Vertrag gibt es noch keine Bestellungen.</w:t>
+              <w:t xml:space="preserve">No orders for this contract number yet.</w:t>
+            </w:r>
+          </w:p>
+        </w:tc>
+        <w:tc>
+          <w:tcPr>
+            <w:tcW w:w="2400" w:type="dxa"/>
+          </w:tcPr>
+          <w:p>
+            <w:r>
+              <w:t xml:space="preserve">Für diese Vertragsnummer gibt es noch keine Bestellungen.</w:t>
             </w:r>
           </w:p>
         </w:tc>
@@ -17431,7 +17939,7 @@
           </w:tcPr>
           <w:p>
             <w:r>
-              <w:t xml:space="preserve">Bestellung {number} für diese Vertragsnummer</w:t>
+              <w:t xml:space="preserve">Bestellung {number} zu dieser Vertragsnummer</w:t>
             </w:r>
           </w:p>
         </w:tc>
@@ -17715,17 +18223,17 @@
           </w:tcPr>
           <w:p>
             <w:r>
-              <w:t xml:space="preserve">Save contract</w:t>
-            </w:r>
-          </w:p>
-        </w:tc>
-        <w:tc>
-          <w:tcPr>
-            <w:tcW w:w="2400" w:type="dxa"/>
-          </w:tcPr>
-          <w:p>
-            <w:r>
-              <w:t xml:space="preserve">Vertrag speichern</w:t>
+              <w:t xml:space="preserve">Save contract number</w:t>
+            </w:r>
+          </w:p>
+        </w:tc>
+        <w:tc>
+          <w:tcPr>
+            <w:tcW w:w="2400" w:type="dxa"/>
+          </w:tcPr>
+          <w:p>
+            <w:r>
+              <w:t xml:space="preserve">Vertragsnummer speichern</w:t>
             </w:r>
           </w:p>
         </w:tc>
@@ -18471,17 +18979,17 @@
           </w:tcPr>
           <w:p>
             <w:r>
-              <w:t xml:space="preserve">View orders for this contract</w:t>
-            </w:r>
-          </w:p>
-        </w:tc>
-        <w:tc>
-          <w:tcPr>
-            <w:tcW w:w="2400" w:type="dxa"/>
-          </w:tcPr>
-          <w:p>
-            <w:r>
-              <w:t xml:space="preserve">Bestellungen für diese Vertragsnummer anzeigen</w:t>
+              <w:t xml:space="preserve">View orders for this contract number</w:t>
+            </w:r>
+          </w:p>
+        </w:tc>
+        <w:tc>
+          <w:tcPr>
+            <w:tcW w:w="2400" w:type="dxa"/>
+          </w:tcPr>
+          <w:p>
+            <w:r>
+              <w:t xml:space="preserve">Bestellungen zu dieser Vertragsnummer anzeigen</w:t>
             </w:r>
           </w:p>
         </w:tc>
@@ -20067,17 +20575,17 @@
           </w:tcPr>
           <w:p>
             <w:r>
-              <w:t xml:space="preserve">Claim element overview</w:t>
-            </w:r>
-          </w:p>
-        </w:tc>
-        <w:tc>
-          <w:tcPr>
-            <w:tcW w:w="2400" w:type="dxa"/>
-          </w:tcPr>
-          <w:p>
-            <w:r>
-              <w:t xml:space="preserve">Reklamationsübersicht nach Element</w:t>
+              <w:t xml:space="preserve">Claims by item</w:t>
+            </w:r>
+          </w:p>
+        </w:tc>
+        <w:tc>
+          <w:tcPr>
+            <w:tcW w:w="2400" w:type="dxa"/>
+          </w:tcPr>
+          <w:p>
+            <w:r>
+              <w:t xml:space="preserve">Reklamationen nach Artikel</w:t>
             </w:r>
           </w:p>
         </w:tc>
@@ -20193,17 +20701,17 @@
           </w:tcPr>
           <w:p>
             <w:r>
-              <w:t xml:space="preserve">Claims by selected element</w:t>
-            </w:r>
-          </w:p>
-        </w:tc>
-        <w:tc>
-          <w:tcPr>
-            <w:tcW w:w="2400" w:type="dxa"/>
-          </w:tcPr>
-          <w:p>
-            <w:r>
-              <w:t xml:space="preserve">Reklamationen nach ausgewähltem Element</w:t>
+              <w:t xml:space="preserve">Claims by selected item</w:t>
+            </w:r>
+          </w:p>
+        </w:tc>
+        <w:tc>
+          <w:tcPr>
+            <w:tcW w:w="2400" w:type="dxa"/>
+          </w:tcPr>
+          <w:p>
+            <w:r>
+              <w:t xml:space="preserve">Reklamationen nach ausgewähltem Artikel</w:t>
             </w:r>
           </w:p>
         </w:tc>
@@ -20235,17 +20743,17 @@
           </w:tcPr>
           <w:p>
             <w:r>
-              <w:t xml:space="preserve">Claims by selected element and city</w:t>
-            </w:r>
-          </w:p>
-        </w:tc>
-        <w:tc>
-          <w:tcPr>
-            <w:tcW w:w="2400" w:type="dxa"/>
-          </w:tcPr>
-          <w:p>
-            <w:r>
-              <w:t xml:space="preserve">Reklamationen nach ausgewähltem Element und Stadt</w:t>
+              <w:t xml:space="preserve">Claims by selected item and city</w:t>
+            </w:r>
+          </w:p>
+        </w:tc>
+        <w:tc>
+          <w:tcPr>
+            <w:tcW w:w="2400" w:type="dxa"/>
+          </w:tcPr>
+          <w:p>
+            <w:r>
+              <w:t xml:space="preserve">Reklamationen nach Artikel und Stadt</w:t>
             </w:r>
           </w:p>
         </w:tc>
@@ -20277,17 +20785,17 @@
           </w:tcPr>
           <w:p>
             <w:r>
-              <w:t xml:space="preserve">Ranked by selected kitchen elements and the city submitted in the service claim form.</w:t>
-            </w:r>
-          </w:p>
-        </w:tc>
-        <w:tc>
-          <w:tcPr>
-            <w:tcW w:w="2400" w:type="dxa"/>
-          </w:tcPr>
-          <w:p>
-            <w:r>
-              <w:t xml:space="preserve">Sortiert nach ausgewählten Küchenelementen und der im Reklamationsformular angegebenen Stadt.</w:t>
+              <w:t xml:space="preserve">Ranked by selected kitchen items and the city submitted in the service request form.</w:t>
+            </w:r>
+          </w:p>
+        </w:tc>
+        <w:tc>
+          <w:tcPr>
+            <w:tcW w:w="2400" w:type="dxa"/>
+          </w:tcPr>
+          <w:p>
+            <w:r>
+              <w:t xml:space="preserve">Sortiert nach ausgewählten Artikeln und der im Reklamationsformular angegebenen Stadt.</w:t>
             </w:r>
           </w:p>
         </w:tc>
@@ -20319,17 +20827,17 @@
           </w:tcPr>
           <w:p>
             <w:r>
-              <w:t xml:space="preserve">Claims by selected element and country</w:t>
-            </w:r>
-          </w:p>
-        </w:tc>
-        <w:tc>
-          <w:tcPr>
-            <w:tcW w:w="2400" w:type="dxa"/>
-          </w:tcPr>
-          <w:p>
-            <w:r>
-              <w:t xml:space="preserve">Reklamationen nach ausgewähltem Element und Land</w:t>
+              <w:t xml:space="preserve">Claims by selected item and country</w:t>
+            </w:r>
+          </w:p>
+        </w:tc>
+        <w:tc>
+          <w:tcPr>
+            <w:tcW w:w="2400" w:type="dxa"/>
+          </w:tcPr>
+          <w:p>
+            <w:r>
+              <w:t xml:space="preserve">Reklamationen nach Artikel und Land</w:t>
             </w:r>
           </w:p>
         </w:tc>
@@ -20361,17 +20869,17 @@
           </w:tcPr>
           <w:p>
             <w:r>
-              <w:t xml:space="preserve">Ranked by selected kitchen elements and the country submitted in the service claim form.</w:t>
-            </w:r>
-          </w:p>
-        </w:tc>
-        <w:tc>
-          <w:tcPr>
-            <w:tcW w:w="2400" w:type="dxa"/>
-          </w:tcPr>
-          <w:p>
-            <w:r>
-              <w:t xml:space="preserve">Sortiert nach ausgewählten Küchenelementen und dem im Reklamationsformular angegebenen Land.</w:t>
+              <w:t xml:space="preserve">Ranked by selected kitchen items and the country submitted in the service request form.</w:t>
+            </w:r>
+          </w:p>
+        </w:tc>
+        <w:tc>
+          <w:tcPr>
+            <w:tcW w:w="2400" w:type="dxa"/>
+          </w:tcPr>
+          <w:p>
+            <w:r>
+              <w:t xml:space="preserve">Sortiert nach ausgewählten Artikeln und dem im Reklamationsformular angegebenen Land.</w:t>
             </w:r>
           </w:p>
         </w:tc>
@@ -20403,17 +20911,17 @@
           </w:tcPr>
           <w:p>
             <w:r>
-              <w:t xml:space="preserve">Ranked by the kitchen elements selected in the service claim form.</w:t>
-            </w:r>
-          </w:p>
-        </w:tc>
-        <w:tc>
-          <w:tcPr>
-            <w:tcW w:w="2400" w:type="dxa"/>
-          </w:tcPr>
-          <w:p>
-            <w:r>
-              <w:t xml:space="preserve">Sortiert nach den Küchenelementen, die im Reklamationsformular ausgewählt wurden.</w:t>
+              <w:t xml:space="preserve">Ranked by the kitchen items selected in the service request form.</w:t>
+            </w:r>
+          </w:p>
+        </w:tc>
+        <w:tc>
+          <w:tcPr>
+            <w:tcW w:w="2400" w:type="dxa"/>
+          </w:tcPr>
+          <w:p>
+            <w:r>
+              <w:t xml:space="preserve">Sortiert nach den Artikeln, die im Reklamationsformular ausgewählt wurden.</w:t>
             </w:r>
           </w:p>
         </w:tc>
@@ -20949,17 +21457,17 @@
           </w:tcPr>
           <w:p>
             <w:r>
-              <w:t xml:space="preserve">{objects} objects, {contracts} contracts, {orders} orders</w:t>
-            </w:r>
-          </w:p>
-        </w:tc>
-        <w:tc>
-          <w:tcPr>
-            <w:tcW w:w="2400" w:type="dxa"/>
-          </w:tcPr>
-          <w:p>
-            <w:r>
-              <w:t xml:space="preserve">{objects} Objekte, {contracts} Verträge, {orders} Bestellungen</w:t>
+              <w:t xml:space="preserve">{objects} objects, {contracts} contract numbers, {orders} orders</w:t>
+            </w:r>
+          </w:p>
+        </w:tc>
+        <w:tc>
+          <w:tcPr>
+            <w:tcW w:w="2400" w:type="dxa"/>
+          </w:tcPr>
+          <w:p>
+            <w:r>
+              <w:t xml:space="preserve">{objects} Objekte, {contracts} Vertragsnummern, {orders} Bestellungen</w:t>
             </w:r>
           </w:p>
         </w:tc>
@@ -21285,17 +21793,17 @@
           </w:tcPr>
           <w:p>
             <w:r>
-              <w:t xml:space="preserve">Contract activity</w:t>
-            </w:r>
-          </w:p>
-        </w:tc>
-        <w:tc>
-          <w:tcPr>
-            <w:tcW w:w="2400" w:type="dxa"/>
-          </w:tcPr>
-          <w:p>
-            <w:r>
-              <w:t xml:space="preserve">Vertragsaktivität</w:t>
+              <w:t xml:space="preserve">Contract number activity</w:t>
+            </w:r>
+          </w:p>
+        </w:tc>
+        <w:tc>
+          <w:tcPr>
+            <w:tcW w:w="2400" w:type="dxa"/>
+          </w:tcPr>
+          <w:p>
+            <w:r>
+              <w:t xml:space="preserve">Nutzung von Vertragsnummern</w:t>
             </w:r>
           </w:p>
         </w:tc>
@@ -21453,17 +21961,17 @@
           </w:tcPr>
           <w:p>
             <w:r>
-              <w:t xml:space="preserve">Contracts</w:t>
-            </w:r>
-          </w:p>
-        </w:tc>
-        <w:tc>
-          <w:tcPr>
-            <w:tcW w:w="2400" w:type="dxa"/>
-          </w:tcPr>
-          <w:p>
-            <w:r>
-              <w:t xml:space="preserve">Verträge</w:t>
+              <w:t xml:space="preserve">Contract numbers</w:t>
+            </w:r>
+          </w:p>
+        </w:tc>
+        <w:tc>
+          <w:tcPr>
+            <w:tcW w:w="2400" w:type="dxa"/>
+          </w:tcPr>
+          <w:p>
+            <w:r>
+              <w:t xml:space="preserve">Vertragsnummern</w:t>
             </w:r>
           </w:p>
         </w:tc>
@@ -21957,17 +22465,17 @@
           </w:tcPr>
           <w:p>
             <w:r>
-              <w:t xml:space="preserve">Contract</w:t>
-            </w:r>
-          </w:p>
-        </w:tc>
-        <w:tc>
-          <w:tcPr>
-            <w:tcW w:w="2400" w:type="dxa"/>
-          </w:tcPr>
-          <w:p>
-            <w:r>
-              <w:t xml:space="preserve">Vertrag</w:t>
+              <w:t xml:space="preserve">Contract number</w:t>
+            </w:r>
+          </w:p>
+        </w:tc>
+        <w:tc>
+          <w:tcPr>
+            <w:tcW w:w="2400" w:type="dxa"/>
+          </w:tcPr>
+          <w:p>
+            <w:r>
+              <w:t xml:space="preserve">Vertragsnummer</w:t>
             </w:r>
           </w:p>
         </w:tc>
@@ -22125,17 +22633,17 @@
           </w:tcPr>
           <w:p>
             <w:r>
-              <w:t xml:space="preserve">contracts</w:t>
-            </w:r>
-          </w:p>
-        </w:tc>
-        <w:tc>
-          <w:tcPr>
-            <w:tcW w:w="2400" w:type="dxa"/>
-          </w:tcPr>
-          <w:p>
-            <w:r>
-              <w:t xml:space="preserve">Verträge</w:t>
+              <w:t xml:space="preserve">contract numbers</w:t>
+            </w:r>
+          </w:p>
+        </w:tc>
+        <w:tc>
+          <w:tcPr>
+            <w:tcW w:w="2400" w:type="dxa"/>
+          </w:tcPr>
+          <w:p>
+            <w:r>
+              <w:t xml:space="preserve">Vertragsnummern</w:t>
             </w:r>
           </w:p>
         </w:tc>
@@ -22209,17 +22717,17 @@
           </w:tcPr>
           <w:p>
             <w:r>
-              <w:t xml:space="preserve">Contracts</w:t>
-            </w:r>
-          </w:p>
-        </w:tc>
-        <w:tc>
-          <w:tcPr>
-            <w:tcW w:w="2400" w:type="dxa"/>
-          </w:tcPr>
-          <w:p>
-            <w:r>
-              <w:t xml:space="preserve">Verträge</w:t>
+              <w:t xml:space="preserve">Contract numbers</w:t>
+            </w:r>
+          </w:p>
+        </w:tc>
+        <w:tc>
+          <w:tcPr>
+            <w:tcW w:w="2400" w:type="dxa"/>
+          </w:tcPr>
+          <w:p>
+            <w:r>
+              <w:t xml:space="preserve">Vertragsnummern</w:t>
             </w:r>
           </w:p>
         </w:tc>
@@ -22797,17 +23305,17 @@
           </w:tcPr>
           <w:p>
             <w:r>
-              <w:t xml:space="preserve">Contract</w:t>
-            </w:r>
-          </w:p>
-        </w:tc>
-        <w:tc>
-          <w:tcPr>
-            <w:tcW w:w="2400" w:type="dxa"/>
-          </w:tcPr>
-          <w:p>
-            <w:r>
-              <w:t xml:space="preserve">Vertrag</w:t>
+              <w:t xml:space="preserve">Contract number</w:t>
+            </w:r>
+          </w:p>
+        </w:tc>
+        <w:tc>
+          <w:tcPr>
+            <w:tcW w:w="2400" w:type="dxa"/>
+          </w:tcPr>
+          <w:p>
+            <w:r>
+              <w:t xml:space="preserve">Vertragsnummer</w:t>
             </w:r>
           </w:p>
         </w:tc>
@@ -22965,17 +23473,17 @@
           </w:tcPr>
           <w:p>
             <w:r>
-              <w:t xml:space="preserve">View all contracts</w:t>
-            </w:r>
-          </w:p>
-        </w:tc>
-        <w:tc>
-          <w:tcPr>
-            <w:tcW w:w="2400" w:type="dxa"/>
-          </w:tcPr>
-          <w:p>
-            <w:r>
-              <w:t xml:space="preserve">Alle Verträge anzeigen</w:t>
+              <w:t xml:space="preserve">View all contract numbers</w:t>
+            </w:r>
+          </w:p>
+        </w:tc>
+        <w:tc>
+          <w:tcPr>
+            <w:tcW w:w="2400" w:type="dxa"/>
+          </w:tcPr>
+          <w:p>
+            <w:r>
+              <w:t xml:space="preserve">Alle Vertragsnummern anzeigen</w:t>
             </w:r>
           </w:p>
         </w:tc>
@@ -23553,7 +24061,7 @@
           </w:tcPr>
           <w:p>
             <w:r>
-              <w:t xml:space="preserve">Location intelligence</w:t>
+              <w:t xml:space="preserve">Location insights</w:t>
             </w:r>
           </w:p>
         </w:tc>
@@ -23595,17 +24103,17 @@
           </w:tcPr>
           <w:p>
             <w:r>
-              <w:t xml:space="preserve">Search a city or country to turn the dashboard into a geographic lookup and KPI workspace.</w:t>
-            </w:r>
-          </w:p>
-        </w:tc>
-        <w:tc>
-          <w:tcPr>
-            <w:tcW w:w="2400" w:type="dxa"/>
-          </w:tcPr>
-          <w:p>
-            <w:r>
-              <w:t xml:space="preserve">Suchen Sie eine Stadt oder ein Land, um das Dashboard in einen geografischen Such- und KPI-Arbeitsbereich zu verwandeln.</w:t>
+              <w:t xml:space="preserve">Search a city or country to use the dashboard as a geographic KPI workspace.</w:t>
+            </w:r>
+          </w:p>
+        </w:tc>
+        <w:tc>
+          <w:tcPr>
+            <w:tcW w:w="2400" w:type="dxa"/>
+          </w:tcPr>
+          <w:p>
+            <w:r>
+              <w:t xml:space="preserve">Suchen Sie eine Stadt oder ein Land, um das Dashboard als geografischen KPI-Arbeitsbereich zu nutzen.</w:t>
             </w:r>
           </w:p>
         </w:tc>
@@ -23679,17 +24187,17 @@
           </w:tcPr>
           <w:p>
             <w:r>
-              <w:t xml:space="preserve">{scope} search across admin entities with KPI summaries and drilldowns.</w:t>
-            </w:r>
-          </w:p>
-        </w:tc>
-        <w:tc>
-          <w:tcPr>
-            <w:tcW w:w="2400" w:type="dxa"/>
-          </w:tcPr>
-          <w:p>
-            <w:r>
-              <w:t xml:space="preserve">{scope}-Suche über Admin-Entitäten mit KPI-Zusammenfassungen und Drilldowns.</w:t>
+              <w:t xml:space="preserve">{scope} search across admin records with KPI summaries and drilldowns.</w:t>
+            </w:r>
+          </w:p>
+        </w:tc>
+        <w:tc>
+          <w:tcPr>
+            <w:tcW w:w="2400" w:type="dxa"/>
+          </w:tcPr>
+          <w:p>
+            <w:r>
+              <w:t xml:space="preserve">{scope}-Suche über Admin-Datensätze mit KPI-Zusammenfassungen und Drilldowns.</w:t>
             </w:r>
           </w:p>
         </w:tc>
@@ -24057,17 +24565,17 @@
           </w:tcPr>
           <w:p>
             <w:r>
-              <w:t xml:space="preserve">Monitor sales, workflow movement, kitchen demand, and item performance.</w:t>
-            </w:r>
-          </w:p>
-        </w:tc>
-        <w:tc>
-          <w:tcPr>
-            <w:tcW w:w="2400" w:type="dxa"/>
-          </w:tcPr>
-          <w:p>
-            <w:r>
-              <w:t xml:space="preserve">Verkäufe, Workflow-Status, Küchennachfrage und Artikelperformance überwachen.</w:t>
+              <w:t xml:space="preserve">Track orders, workflow, kitchens, and item performance.</w:t>
+            </w:r>
+          </w:p>
+        </w:tc>
+        <w:tc>
+          <w:tcPr>
+            <w:tcW w:w="2400" w:type="dxa"/>
+          </w:tcPr>
+          <w:p>
+            <w:r>
+              <w:t xml:space="preserve">Bestellungen, Workflows, Küchen und Artikelperformance im Blick.</w:t>
             </w:r>
           </w:p>
         </w:tc>
@@ -24183,17 +24691,17 @@
           </w:tcPr>
           <w:p>
             <w:r>
-              <w:t xml:space="preserve">No selected claim element data for the current filters.</w:t>
-            </w:r>
-          </w:p>
-        </w:tc>
-        <w:tc>
-          <w:tcPr>
-            <w:tcW w:w="2400" w:type="dxa"/>
-          </w:tcPr>
-          <w:p>
-            <w:r>
-              <w:t xml:space="preserve">Keine Daten zu ausgewählten Reklamationselementen für die aktuellen Filter.</w:t>
+              <w:t xml:space="preserve">No item-level claim data for the current filters.</w:t>
+            </w:r>
+          </w:p>
+        </w:tc>
+        <w:tc>
+          <w:tcPr>
+            <w:tcW w:w="2400" w:type="dxa"/>
+          </w:tcPr>
+          <w:p>
+            <w:r>
+              <w:t xml:space="preserve">Keine Reklamationsdaten nach Artikel für die aktuellen Filter.</w:t>
             </w:r>
           </w:p>
         </w:tc>
@@ -24477,17 +24985,17 @@
           </w:tcPr>
           <w:p>
             <w:r>
-              <w:t xml:space="preserve">No contracts matched this location.</w:t>
-            </w:r>
-          </w:p>
-        </w:tc>
-        <w:tc>
-          <w:tcPr>
-            <w:tcW w:w="2400" w:type="dxa"/>
-          </w:tcPr>
-          <w:p>
-            <w:r>
-              <w:t xml:space="preserve">Keine Verträge für diesen Standort gefunden.</w:t>
+              <w:t xml:space="preserve">No contract numbers matched this location.</w:t>
+            </w:r>
+          </w:p>
+        </w:tc>
+        <w:tc>
+          <w:tcPr>
+            <w:tcW w:w="2400" w:type="dxa"/>
+          </w:tcPr>
+          <w:p>
+            <w:r>
+              <w:t xml:space="preserve">Keine Vertragsnummern für diesen Standort gefunden.</w:t>
             </w:r>
           </w:p>
         </w:tc>
@@ -24603,17 +25111,17 @@
           </w:tcPr>
           <w:p>
             <w:r>
-              <w:t xml:space="preserve">No matching entity data yet</w:t>
-            </w:r>
-          </w:p>
-        </w:tc>
-        <w:tc>
-          <w:tcPr>
-            <w:tcW w:w="2400" w:type="dxa"/>
-          </w:tcPr>
-          <w:p>
-            <w:r>
-              <w:t xml:space="preserve">Noch keine passenden Entitätsdaten</w:t>
+              <w:t xml:space="preserve">No matching records yet</w:t>
+            </w:r>
+          </w:p>
+        </w:tc>
+        <w:tc>
+          <w:tcPr>
+            <w:tcW w:w="2400" w:type="dxa"/>
+          </w:tcPr>
+          <w:p>
+            <w:r>
+              <w:t xml:space="preserve">Noch keine passenden Datensätze</w:t>
             </w:r>
           </w:p>
         </w:tc>
@@ -25033,7 +25541,7 @@
           </w:tcPr>
           <w:p>
             <w:r>
-              <w:t xml:space="preserve">Keine Projekt-, Vertrags- oder Bestelldaten passen zu den aktuellen Filtern.</w:t>
+              <w:t xml:space="preserve">Keine Projekt-, Vertragsnummern- oder Bestelldaten passen zu den aktuellen Filtern.</w:t>
             </w:r>
           </w:p>
         </w:tc>
@@ -25527,17 +26035,17 @@
           </w:tcPr>
           <w:p>
             <w:r>
-              <w:t xml:space="preserve">Open contracts</w:t>
-            </w:r>
-          </w:p>
-        </w:tc>
-        <w:tc>
-          <w:tcPr>
-            <w:tcW w:w="2400" w:type="dxa"/>
-          </w:tcPr>
-          <w:p>
-            <w:r>
-              <w:t xml:space="preserve">Verträge öffnen</w:t>
+              <w:t xml:space="preserve">Open contract numbers</w:t>
+            </w:r>
+          </w:p>
+        </w:tc>
+        <w:tc>
+          <w:tcPr>
+            <w:tcW w:w="2400" w:type="dxa"/>
+          </w:tcPr>
+          <w:p>
+            <w:r>
+              <w:t xml:space="preserve">Vertragsnummern öffnen</w:t>
             </w:r>
           </w:p>
         </w:tc>
@@ -25621,7 +26129,7 @@
           </w:tcPr>
           <w:p>
             <w:r>
-              <w:t xml:space="preserve">Gesellschaften öffnen</w:t>
+              <w:t xml:space="preserve">Wohnungsgesellschaften öffnen</w:t>
             </w:r>
           </w:p>
         </w:tc>
@@ -25957,7 +26465,7 @@
           </w:tcPr>
           <w:p>
             <w:r>
-              <w:t xml:space="preserve">Datensätze von Wohnungsgesellschaften, die Vertragsnummern zugewiesen werden können.</w:t>
+              <w:t xml:space="preserve">Datensätze von Wohnungsgesellschaften verfügbar für die Vergabe von Vertragsnummern</w:t>
             </w:r>
           </w:p>
         </w:tc>
@@ -26199,17 +26707,17 @@
           </w:tcPr>
           <w:p>
             <w:r>
-              <w:t xml:space="preserve">{contracts} contracts, {orders} orders</w:t>
-            </w:r>
-          </w:p>
-        </w:tc>
-        <w:tc>
-          <w:tcPr>
-            <w:tcW w:w="2400" w:type="dxa"/>
-          </w:tcPr>
-          <w:p>
-            <w:r>
-              <w:t xml:space="preserve">{contracts} Verträge, {orders} Bestellungen</w:t>
+              <w:t xml:space="preserve">{contracts} contract numbers, {orders} orders</w:t>
+            </w:r>
+          </w:p>
+        </w:tc>
+        <w:tc>
+          <w:tcPr>
+            <w:tcW w:w="2400" w:type="dxa"/>
+          </w:tcPr>
+          <w:p>
+            <w:r>
+              <w:t xml:space="preserve">{contracts} Vertragsnummern, {orders} Bestellungen</w:t>
             </w:r>
           </w:p>
         </w:tc>
@@ -26913,17 +27421,17 @@
           </w:tcPr>
           <w:p>
             <w:r>
-              <w:t xml:space="preserve">Search locations across companies, objects, contracts, and orders</w:t>
-            </w:r>
-          </w:p>
-        </w:tc>
-        <w:tc>
-          <w:tcPr>
-            <w:tcW w:w="2400" w:type="dxa"/>
-          </w:tcPr>
-          <w:p>
-            <w:r>
-              <w:t xml:space="preserve">Standorte über Gesellschaften, Objekte, Verträge und Bestellungen durchsuchen</w:t>
+              <w:t xml:space="preserve">Search locations across companies, objects, contract numbers, and orders</w:t>
+            </w:r>
+          </w:p>
+        </w:tc>
+        <w:tc>
+          <w:tcPr>
+            <w:tcW w:w="2400" w:type="dxa"/>
+          </w:tcPr>
+          <w:p>
+            <w:r>
+              <w:t xml:space="preserve">Standorte über Gesellschaften, Objekte, Vertragsnummern und Bestellungen durchsuchen</w:t>
             </w:r>
           </w:p>
         </w:tc>
@@ -27039,17 +27547,17 @@
           </w:tcPr>
           <w:p>
             <w:r>
-              <w:t xml:space="preserve">Selected elements</w:t>
-            </w:r>
-          </w:p>
-        </w:tc>
-        <w:tc>
-          <w:tcPr>
-            <w:tcW w:w="2400" w:type="dxa"/>
-          </w:tcPr>
-          <w:p>
-            <w:r>
-              <w:t xml:space="preserve">Ausgewählte Elemente</w:t>
+              <w:t xml:space="preserve">Selected items</w:t>
+            </w:r>
+          </w:p>
+        </w:tc>
+        <w:tc>
+          <w:tcPr>
+            <w:tcW w:w="2400" w:type="dxa"/>
+          </w:tcPr>
+          <w:p>
+            <w:r>
+              <w:t xml:space="preserve">Ausgewählte Artikel</w:t>
             </w:r>
           </w:p>
         </w:tc>
@@ -27879,17 +28387,17 @@
           </w:tcPr>
           <w:p>
             <w:r>
-              <w:t xml:space="preserve">Unused contracts</w:t>
-            </w:r>
-          </w:p>
-        </w:tc>
-        <w:tc>
-          <w:tcPr>
-            <w:tcW w:w="2400" w:type="dxa"/>
-          </w:tcPr>
-          <w:p>
-            <w:r>
-              <w:t xml:space="preserve">Ungenutzte Verträge</w:t>
+              <w:t xml:space="preserve">Unused contract numbers</w:t>
+            </w:r>
+          </w:p>
+        </w:tc>
+        <w:tc>
+          <w:tcPr>
+            <w:tcW w:w="2400" w:type="dxa"/>
+          </w:tcPr>
+          <w:p>
+            <w:r>
+              <w:t xml:space="preserve">Ungenutzte Vertragsnummern</w:t>
             </w:r>
           </w:p>
         </w:tc>
@@ -27921,17 +28429,17 @@
           </w:tcPr>
           <w:p>
             <w:r>
-              <w:t xml:space="preserve">Used contracts</w:t>
-            </w:r>
-          </w:p>
-        </w:tc>
-        <w:tc>
-          <w:tcPr>
-            <w:tcW w:w="2400" w:type="dxa"/>
-          </w:tcPr>
-          <w:p>
-            <w:r>
-              <w:t xml:space="preserve">Genutzte Verträge</w:t>
+              <w:t xml:space="preserve">Used contract numbers</w:t>
+            </w:r>
+          </w:p>
+        </w:tc>
+        <w:tc>
+          <w:tcPr>
+            <w:tcW w:w="2400" w:type="dxa"/>
+          </w:tcPr>
+          <w:p>
+            <w:r>
+              <w:t xml:space="preserve">Genutzte Vertragsnummern</w:t>
             </w:r>
           </w:p>
         </w:tc>
@@ -28719,17 +29227,17 @@
           </w:tcPr>
           <w:p>
             <w:r>
-              <w:t xml:space="preserve">Contract numbers are managed in Contracts.</w:t>
-            </w:r>
-          </w:p>
-        </w:tc>
-        <w:tc>
-          <w:tcPr>
-            <w:tcW w:w="2400" w:type="dxa"/>
-          </w:tcPr>
-          <w:p>
-            <w:r>
-              <w:t xml:space="preserve">Vertragsnummern werden unter Verträge verwaltet.</w:t>
+              <w:t xml:space="preserve">Manage contract numbers from the Contract numbers page.</w:t>
+            </w:r>
+          </w:p>
+        </w:tc>
+        <w:tc>
+          <w:tcPr>
+            <w:tcW w:w="2400" w:type="dxa"/>
+          </w:tcPr>
+          <w:p>
+            <w:r>
+              <w:t xml:space="preserve">Vertragsnummern werden auf der Seite Vertragsnummern verwaltet.</w:t>
             </w:r>
           </w:p>
         </w:tc>
@@ -29769,17 +30277,17 @@
           </w:tcPr>
           <w:p>
             <w:r>
-              <w:t xml:space="preserve">Manage contracts</w:t>
-            </w:r>
-          </w:p>
-        </w:tc>
-        <w:tc>
-          <w:tcPr>
-            <w:tcW w:w="2400" w:type="dxa"/>
-          </w:tcPr>
-          <w:p>
-            <w:r>
-              <w:t xml:space="preserve">Verträge verwalten</w:t>
+              <w:t xml:space="preserve">Manage contract numbers</w:t>
+            </w:r>
+          </w:p>
+        </w:tc>
+        <w:tc>
+          <w:tcPr>
+            <w:tcW w:w="2400" w:type="dxa"/>
+          </w:tcPr>
+          <w:p>
+            <w:r>
+              <w:t xml:space="preserve">Vertragsnummern verwalten</w:t>
             </w:r>
           </w:p>
         </w:tc>
@@ -30357,17 +30865,17 @@
           </w:tcPr>
           <w:p>
             <w:r>
-              <w:t xml:space="preserve">Reusable contract numbers now live in the dedicated Contracts admin page.</w:t>
-            </w:r>
-          </w:p>
-        </w:tc>
-        <w:tc>
-          <w:tcPr>
-            <w:tcW w:w="2400" w:type="dxa"/>
-          </w:tcPr>
-          <w:p>
-            <w:r>
-              <w:t xml:space="preserve">Wiederverwendbare Vertragsnummern werden jetzt auf der separaten Vertragsseite im Adminbereich verwaltet.</w:t>
+              <w:t xml:space="preserve">Reusable contract numbers are managed on the Contract numbers admin page.</w:t>
+            </w:r>
+          </w:p>
+        </w:tc>
+        <w:tc>
+          <w:tcPr>
+            <w:tcW w:w="2400" w:type="dxa"/>
+          </w:tcPr>
+          <w:p>
+            <w:r>
+              <w:t xml:space="preserve">Wiederverwendbare Vertragsnummern werden auf der Adminseite für Vertragsnummern verwaltet.</w:t>
             </w:r>
           </w:p>
         </w:tc>
@@ -30693,17 +31201,17 @@
           </w:tcPr>
           <w:p>
             <w:r>
-              <w:t xml:space="preserve">contracts</w:t>
-            </w:r>
-          </w:p>
-        </w:tc>
-        <w:tc>
-          <w:tcPr>
-            <w:tcW w:w="2400" w:type="dxa"/>
-          </w:tcPr>
-          <w:p>
-            <w:r>
-              <w:t xml:space="preserve">Verträge</w:t>
+              <w:t xml:space="preserve">contract numbers</w:t>
+            </w:r>
+          </w:p>
+        </w:tc>
+        <w:tc>
+          <w:tcPr>
+            <w:tcW w:w="2400" w:type="dxa"/>
+          </w:tcPr>
+          <w:p>
+            <w:r>
+              <w:t xml:space="preserve">Vertragsnummern</w:t>
             </w:r>
           </w:p>
         </w:tc>
@@ -30735,17 +31243,17 @@
           </w:tcPr>
           <w:p>
             <w:r>
-              <w:t xml:space="preserve">{count} contracts</w:t>
-            </w:r>
-          </w:p>
-        </w:tc>
-        <w:tc>
-          <w:tcPr>
-            <w:tcW w:w="2400" w:type="dxa"/>
-          </w:tcPr>
-          <w:p>
-            <w:r>
-              <w:t xml:space="preserve">{count} Verträge</w:t>
+              <w:t xml:space="preserve">{count} contract numbers</w:t>
+            </w:r>
+          </w:p>
+        </w:tc>
+        <w:tc>
+          <w:tcPr>
+            <w:tcW w:w="2400" w:type="dxa"/>
+          </w:tcPr>
+          <w:p>
+            <w:r>
+              <w:t xml:space="preserve">{count} Vertragsnummern</w:t>
             </w:r>
           </w:p>
         </w:tc>
@@ -30777,17 +31285,17 @@
           </w:tcPr>
           <w:p>
             <w:r>
-              <w:t xml:space="preserve">{count} contract</w:t>
-            </w:r>
-          </w:p>
-        </w:tc>
-        <w:tc>
-          <w:tcPr>
-            <w:tcW w:w="2400" w:type="dxa"/>
-          </w:tcPr>
-          <w:p>
-            <w:r>
-              <w:t xml:space="preserve">{count} Vertrag</w:t>
+              <w:t xml:space="preserve">{count} contract number</w:t>
+            </w:r>
+          </w:p>
+        </w:tc>
+        <w:tc>
+          <w:tcPr>
+            <w:tcW w:w="2400" w:type="dxa"/>
+          </w:tcPr>
+          <w:p>
+            <w:r>
+              <w:t xml:space="preserve">{count} Vertragsnummer</w:t>
             </w:r>
           </w:p>
         </w:tc>
@@ -30819,17 +31327,17 @@
           </w:tcPr>
           <w:p>
             <w:r>
-              <w:t xml:space="preserve">Contracts</w:t>
-            </w:r>
-          </w:p>
-        </w:tc>
-        <w:tc>
-          <w:tcPr>
-            <w:tcW w:w="2400" w:type="dxa"/>
-          </w:tcPr>
-          <w:p>
-            <w:r>
-              <w:t xml:space="preserve">Verträge</w:t>
+              <w:t xml:space="preserve">Contract numbers</w:t>
+            </w:r>
+          </w:p>
+        </w:tc>
+        <w:tc>
+          <w:tcPr>
+            <w:tcW w:w="2400" w:type="dxa"/>
+          </w:tcPr>
+          <w:p>
+            <w:r>
+              <w:t xml:space="preserve">Vertragsnummern</w:t>
             </w:r>
           </w:p>
         </w:tc>
@@ -31793,17 +32301,17 @@
           </w:tcPr>
           <w:p>
             <w:r>
-              <w:t xml:space="preserve">Contract access</w:t>
-            </w:r>
-          </w:p>
-        </w:tc>
-        <w:tc>
-          <w:tcPr>
-            <w:tcW w:w="2400" w:type="dxa"/>
-          </w:tcPr>
-          <w:p>
-            <w:r>
-              <w:t xml:space="preserve">Vertragszugang</w:t>
+              <w:t xml:space="preserve">Contract number access</w:t>
+            </w:r>
+          </w:p>
+        </w:tc>
+        <w:tc>
+          <w:tcPr>
+            <w:tcW w:w="2400" w:type="dxa"/>
+          </w:tcPr>
+          <w:p>
+            <w:r>
+              <w:t xml:space="preserve">Zugang per Vertragsnummer</w:t>
             </w:r>
           </w:p>
         </w:tc>
@@ -31877,17 +32385,17 @@
           </w:tcPr>
           <w:p>
             <w:r>
-              <w:t xml:space="preserve">Contract order</w:t>
-            </w:r>
-          </w:p>
-        </w:tc>
-        <w:tc>
-          <w:tcPr>
-            <w:tcW w:w="2400" w:type="dxa"/>
-          </w:tcPr>
-          <w:p>
-            <w:r>
-              <w:t xml:space="preserve">Vertragsbestellung</w:t>
+              <w:t xml:space="preserve">Order sequence</w:t>
+            </w:r>
+          </w:p>
+        </w:tc>
+        <w:tc>
+          <w:tcPr>
+            <w:tcW w:w="2400" w:type="dxa"/>
+          </w:tcPr>
+          <w:p>
+            <w:r>
+              <w:t xml:space="preserve">Bestellfolge</w:t>
             </w:r>
           </w:p>
         </w:tc>
@@ -32181,7 +32689,7 @@
           </w:tcPr>
           <w:p>
             <w:r>
-              <w:t xml:space="preserve">1. Bestellung für diesen Vertrag</w:t>
+              <w:t xml:space="preserve">1. Bestellung zu dieser Vertragsnummer</w:t>
             </w:r>
           </w:p>
         </w:tc>
@@ -32549,17 +33057,17 @@
           </w:tcPr>
           <w:p>
             <w:r>
-              <w:t xml:space="preserve">Linked reusable active contract</w:t>
-            </w:r>
-          </w:p>
-        </w:tc>
-        <w:tc>
-          <w:tcPr>
-            <w:tcW w:w="2400" w:type="dxa"/>
-          </w:tcPr>
-          <w:p>
-            <w:r>
-              <w:t xml:space="preserve">Verknüpfter wiederverwendbarer aktiver Vertrag</w:t>
+              <w:t xml:space="preserve">Linked active reusable contract number</w:t>
+            </w:r>
+          </w:p>
+        </w:tc>
+        <w:tc>
+          <w:tcPr>
+            <w:tcW w:w="2400" w:type="dxa"/>
+          </w:tcPr>
+          <w:p>
+            <w:r>
+              <w:t xml:space="preserve">Verknüpfte aktive Vertragsnummer</w:t>
             </w:r>
           </w:p>
         </w:tc>
@@ -32591,17 +33099,17 @@
           </w:tcPr>
           <w:p>
             <w:r>
-              <w:t xml:space="preserve">Linked reusable inactive contract</w:t>
-            </w:r>
-          </w:p>
-        </w:tc>
-        <w:tc>
-          <w:tcPr>
-            <w:tcW w:w="2400" w:type="dxa"/>
-          </w:tcPr>
-          <w:p>
-            <w:r>
-              <w:t xml:space="preserve">Verknüpfter wiederverwendbarer inaktiver Vertrag</w:t>
+              <w:t xml:space="preserve">Linked inactive reusable contract number</w:t>
+            </w:r>
+          </w:p>
+        </w:tc>
+        <w:tc>
+          <w:tcPr>
+            <w:tcW w:w="2400" w:type="dxa"/>
+          </w:tcPr>
+          <w:p>
+            <w:r>
+              <w:t xml:space="preserve">Verknüpfte inaktive Vertragsnummer</w:t>
             </w:r>
           </w:p>
         </w:tc>
@@ -32759,17 +33267,17 @@
           </w:tcPr>
           <w:p>
             <w:r>
-              <w:t xml:space="preserve">No linked contract record</w:t>
-            </w:r>
-          </w:p>
-        </w:tc>
-        <w:tc>
-          <w:tcPr>
-            <w:tcW w:w="2400" w:type="dxa"/>
-          </w:tcPr>
-          <w:p>
-            <w:r>
-              <w:t xml:space="preserve">Kein verknüpfter Vertragsdatensatz</w:t>
+              <w:t xml:space="preserve">No linked contract number record</w:t>
+            </w:r>
+          </w:p>
+        </w:tc>
+        <w:tc>
+          <w:tcPr>
+            <w:tcW w:w="2400" w:type="dxa"/>
+          </w:tcPr>
+          <w:p>
+            <w:r>
+              <w:t xml:space="preserve">Keine verknüpfte Vertragsnummer</w:t>
             </w:r>
           </w:p>
         </w:tc>
@@ -33021,7 +33529,7 @@
           </w:tcPr>
           <w:p>
             <w:r>
-              <w:t xml:space="preserve">{number}. Bestellung für diesen Vertrag</w:t>
+              <w:t xml:space="preserve">{ordinal}. Bestellung zu dieser Vertragsnummer</w:t>
             </w:r>
           </w:p>
         </w:tc>
@@ -33147,7 +33655,7 @@
           </w:tcPr>
           <w:p>
             <w:r>
-              <w:t xml:space="preserve">1. Bestellung für diesen Vertrag</w:t>
+              <w:t xml:space="preserve">1. Bestellung zu dieser Vertragsnummer</w:t>
             </w:r>
           </w:p>
         </w:tc>
@@ -33903,7 +34411,7 @@
           </w:tcPr>
           <w:p>
             <w:r>
-              <w:t xml:space="preserve">2. Bestellung für diesen Vertrag</w:t>
+              <w:t xml:space="preserve">2. Bestellung zu dieser Vertragsnummer</w:t>
             </w:r>
           </w:p>
         </w:tc>
@@ -34197,7 +34705,7 @@
           </w:tcPr>
           <w:p>
             <w:r>
-              <w:t xml:space="preserve">3. Bestellung für diesen Vertrag</w:t>
+              <w:t xml:space="preserve">3. Bestellung zu dieser Vertragsnummer</w:t>
             </w:r>
           </w:p>
         </w:tc>
@@ -34993,17 +35501,17 @@
           </w:tcPr>
           <w:p>
             <w:r>
-              <w:t xml:space="preserve">Filter by customer, contract, address, kitchen, status, or date.</w:t>
-            </w:r>
-          </w:p>
-        </w:tc>
-        <w:tc>
-          <w:tcPr>
-            <w:tcW w:w="2400" w:type="dxa"/>
-          </w:tcPr>
-          <w:p>
-            <w:r>
-              <w:t xml:space="preserve">Nach Kunde, Vertrag, Adresse, Küche, Status oder Datum filtern.</w:t>
+              <w:t xml:space="preserve">Filter by customer, contract number, address, kitchen, status, or date.</w:t>
+            </w:r>
+          </w:p>
+        </w:tc>
+        <w:tc>
+          <w:tcPr>
+            <w:tcW w:w="2400" w:type="dxa"/>
+          </w:tcPr>
+          <w:p>
+            <w:r>
+              <w:t xml:space="preserve">Nach Kunde, Vertragsnummer, Adresse, Küche, Status oder Datum filtern.</w:t>
             </w:r>
           </w:p>
         </w:tc>
@@ -35035,17 +35543,17 @@
           </w:tcPr>
           <w:p>
             <w:r>
-              <w:t xml:space="preserve">Filter by customer, contract, address, kitchen, status, or date.</w:t>
-            </w:r>
-          </w:p>
-        </w:tc>
-        <w:tc>
-          <w:tcPr>
-            <w:tcW w:w="2400" w:type="dxa"/>
-          </w:tcPr>
-          <w:p>
-            <w:r>
-              <w:t xml:space="preserve">Nach Kunde, Vertrag, Adresse, Küche, Status oder Datum filtern.</w:t>
+              <w:t xml:space="preserve">Filter by customer, contract number, address, kitchen, status, or date.</w:t>
+            </w:r>
+          </w:p>
+        </w:tc>
+        <w:tc>
+          <w:tcPr>
+            <w:tcW w:w="2400" w:type="dxa"/>
+          </w:tcPr>
+          <w:p>
+            <w:r>
+              <w:t xml:space="preserve">Nach Kunde, Vertragsnummer, Adresse, Küche, Status oder Datum filtern.</w:t>
             </w:r>
           </w:p>
         </w:tc>
@@ -35077,17 +35585,17 @@
           </w:tcPr>
           <w:p>
             <w:r>
-              <w:t xml:space="preserve">1st order for contract</w:t>
-            </w:r>
-          </w:p>
-        </w:tc>
-        <w:tc>
-          <w:tcPr>
-            <w:tcW w:w="2400" w:type="dxa"/>
-          </w:tcPr>
-          <w:p>
-            <w:r>
-              <w:t xml:space="preserve">1. Bestellung für Vertrag</w:t>
+              <w:t xml:space="preserve">1st order for contract number</w:t>
+            </w:r>
+          </w:p>
+        </w:tc>
+        <w:tc>
+          <w:tcPr>
+            <w:tcW w:w="2400" w:type="dxa"/>
+          </w:tcPr>
+          <w:p>
+            <w:r>
+              <w:t xml:space="preserve">1. Bestellung zur Vertragsnummer</w:t>
             </w:r>
           </w:p>
         </w:tc>
@@ -35539,17 +36047,17 @@
           </w:tcPr>
           <w:p>
             <w:r>
-              <w:t xml:space="preserve">{ordinal} order for contract</w:t>
-            </w:r>
-          </w:p>
-        </w:tc>
-        <w:tc>
-          <w:tcPr>
-            <w:tcW w:w="2400" w:type="dxa"/>
-          </w:tcPr>
-          <w:p>
-            <w:r>
-              <w:t xml:space="preserve">{number}. Bestellung für Vertrag</w:t>
+              <w:t xml:space="preserve">{ordinal} order for contract number</w:t>
+            </w:r>
+          </w:p>
+        </w:tc>
+        <w:tc>
+          <w:tcPr>
+            <w:tcW w:w="2400" w:type="dxa"/>
+          </w:tcPr>
+          <w:p>
+            <w:r>
+              <w:t xml:space="preserve">{ordinal}. Bestellung zur Vertragsnummer</w:t>
             </w:r>
           </w:p>
         </w:tc>
@@ -35665,17 +36173,17 @@
           </w:tcPr>
           <w:p>
             <w:r>
-              <w:t xml:space="preserve">order for contract</w:t>
-            </w:r>
-          </w:p>
-        </w:tc>
-        <w:tc>
-          <w:tcPr>
-            <w:tcW w:w="2400" w:type="dxa"/>
-          </w:tcPr>
-          <w:p>
-            <w:r>
-              <w:t xml:space="preserve">Bestellung für Vertrag</w:t>
+              <w:t xml:space="preserve">order for contract number</w:t>
+            </w:r>
+          </w:p>
+        </w:tc>
+        <w:tc>
+          <w:tcPr>
+            <w:tcW w:w="2400" w:type="dxa"/>
+          </w:tcPr>
+          <w:p>
+            <w:r>
+              <w:t xml:space="preserve">Bestellung zur Vertragsnummer</w:t>
             </w:r>
           </w:p>
         </w:tc>
@@ -35969,7 +36477,7 @@
           </w:tcPr>
           <w:p>
             <w:r>
-              <w:t xml:space="preserve">Bestellung, Kunde, Vertrag, Stadt...</w:t>
+              <w:t xml:space="preserve">Bestellung, Kunde, Vertragsnummer, Stadt...</w:t>
             </w:r>
           </w:p>
         </w:tc>
@@ -36001,17 +36509,17 @@
           </w:tcPr>
           <w:p>
             <w:r>
-              <w:t xml:space="preserve">2nd order for contract</w:t>
-            </w:r>
-          </w:p>
-        </w:tc>
-        <w:tc>
-          <w:tcPr>
-            <w:tcW w:w="2400" w:type="dxa"/>
-          </w:tcPr>
-          <w:p>
-            <w:r>
-              <w:t xml:space="preserve">2. Bestellung für Vertrag</w:t>
+              <w:t xml:space="preserve">2nd order for contract number</w:t>
+            </w:r>
+          </w:p>
+        </w:tc>
+        <w:tc>
+          <w:tcPr>
+            <w:tcW w:w="2400" w:type="dxa"/>
+          </w:tcPr>
+          <w:p>
+            <w:r>
+              <w:t xml:space="preserve">2. Bestellung zur Vertragsnummer</w:t>
             </w:r>
           </w:p>
         </w:tc>
@@ -36085,17 +36593,17 @@
           </w:tcPr>
           <w:p>
             <w:r>
-              <w:t xml:space="preserve">3rd order for contract</w:t>
-            </w:r>
-          </w:p>
-        </w:tc>
-        <w:tc>
-          <w:tcPr>
-            <w:tcW w:w="2400" w:type="dxa"/>
-          </w:tcPr>
-          <w:p>
-            <w:r>
-              <w:t xml:space="preserve">3. Bestellung für Vertrag</w:t>
+              <w:t xml:space="preserve">3rd order for contract number</w:t>
+            </w:r>
+          </w:p>
+        </w:tc>
+        <w:tc>
+          <w:tcPr>
+            <w:tcW w:w="2400" w:type="dxa"/>
+          </w:tcPr>
+          <w:p>
+            <w:r>
+              <w:t xml:space="preserve">3. Bestellung zur Vertragsnummer</w:t>
             </w:r>
           </w:p>
         </w:tc>
@@ -41262,300 +41770,6 @@
           <w:p>
             <w:r>
               <w:t xml:space="preserve">wasserablauf, pumpt nicht ab, ablaufschlauch, pumpenbereich, e02</w:t>
-            </w:r>
-          </w:p>
-        </w:tc>
-      </w:tr>
-      <w:tr>
-        <w:tc>
-          <w:tcPr>
-            <w:tcW w:w="2400" w:type="dxa"/>
-          </w:tcPr>
-          <w:p>
-            <w:r>
-              <w:t xml:space="preserve">Service claim lookup trigger terms</w:t>
-            </w:r>
-          </w:p>
-        </w:tc>
-        <w:tc>
-          <w:tcPr>
-            <w:tcW w:w="2400" w:type="dxa"/>
-          </w:tcPr>
-          <w:p>
-            <w:r>
-              <w:t xml:space="preserve">lookupEntries[0].triggerTerms</w:t>
-            </w:r>
-          </w:p>
-        </w:tc>
-        <w:tc>
-          <w:tcPr>
-            <w:tcW w:w="2400" w:type="dxa"/>
-          </w:tcPr>
-          <w:p>
-            <w:r>
-              <w:t xml:space="preserve">e1, wasserzulauf, water inlet, inlet hose, zulaufschlauch, water tap, zieht kein wasser, not taking in water</w:t>
-            </w:r>
-          </w:p>
-        </w:tc>
-        <w:tc>
-          <w:tcPr>
-            <w:tcW w:w="2400" w:type="dxa"/>
-          </w:tcPr>
-          <w:p>
-            <w:r>
-              <w:t xml:space="preserve">Mixed EN/DE trigger words</w:t>
-            </w:r>
-          </w:p>
-        </w:tc>
-      </w:tr>
-      <w:tr>
-        <w:tc>
-          <w:tcPr>
-            <w:tcW w:w="2400" w:type="dxa"/>
-          </w:tcPr>
-          <w:p>
-            <w:r>
-              <w:t xml:space="preserve">Service claim lookup trigger terms</w:t>
-            </w:r>
-          </w:p>
-        </w:tc>
-        <w:tc>
-          <w:tcPr>
-            <w:tcW w:w="2400" w:type="dxa"/>
-          </w:tcPr>
-          <w:p>
-            <w:r>
-              <w:t xml:space="preserve">lookupEntries[1].triggerTerms</w:t>
-            </w:r>
-          </w:p>
-        </w:tc>
-        <w:tc>
-          <w:tcPr>
-            <w:tcW w:w="2400" w:type="dxa"/>
-          </w:tcPr>
-          <w:p>
-            <w:r>
-              <w:t xml:space="preserve">e3, temperature, heating, heizung, temperatursensor, not heating, not hot, heizt nicht, water stays cold</w:t>
-            </w:r>
-          </w:p>
-        </w:tc>
-        <w:tc>
-          <w:tcPr>
-            <w:tcW w:w="2400" w:type="dxa"/>
-          </w:tcPr>
-          <w:p>
-            <w:r>
-              <w:t xml:space="preserve">Mixed EN/DE trigger words</w:t>
-            </w:r>
-          </w:p>
-        </w:tc>
-      </w:tr>
-      <w:tr>
-        <w:tc>
-          <w:tcPr>
-            <w:tcW w:w="2400" w:type="dxa"/>
-          </w:tcPr>
-          <w:p>
-            <w:r>
-              <w:t xml:space="preserve">Service claim lookup trigger terms</w:t>
-            </w:r>
-          </w:p>
-        </w:tc>
-        <w:tc>
-          <w:tcPr>
-            <w:tcW w:w="2400" w:type="dxa"/>
-          </w:tcPr>
-          <w:p>
-            <w:r>
-              <w:t xml:space="preserve">lookupEntries[2].triggerTerms</w:t>
-            </w:r>
-          </w:p>
-        </w:tc>
-        <w:tc>
-          <w:tcPr>
-            <w:tcW w:w="2400" w:type="dxa"/>
-          </w:tcPr>
-          <w:p>
-            <w:r>
-              <w:t xml:space="preserve">e4, undicht, leak, overflow, base tray, bodenwanne, pumpt dauerhaft, continuous pumping, beeping, water in the base tray</w:t>
-            </w:r>
-          </w:p>
-        </w:tc>
-        <w:tc>
-          <w:tcPr>
-            <w:tcW w:w="2400" w:type="dxa"/>
-          </w:tcPr>
-          <w:p>
-            <w:r>
-              <w:t xml:space="preserve">Mixed EN/DE trigger words</w:t>
-            </w:r>
-          </w:p>
-        </w:tc>
-      </w:tr>
-      <w:tr>
-        <w:tc>
-          <w:tcPr>
-            <w:tcW w:w="2400" w:type="dxa"/>
-          </w:tcPr>
-          <w:p>
-            <w:r>
-              <w:t xml:space="preserve">Service claim lookup trigger terms</w:t>
-            </w:r>
-          </w:p>
-        </w:tc>
-        <w:tc>
-          <w:tcPr>
-            <w:tcW w:w="2400" w:type="dxa"/>
-          </w:tcPr>
-          <w:p>
-            <w:r>
-              <w:t xml:space="preserve">lookupEntries[3].triggerTerms</w:t>
-            </w:r>
-          </w:p>
-        </w:tc>
-        <w:tc>
-          <w:tcPr>
-            <w:tcW w:w="2400" w:type="dxa"/>
-          </w:tcPr>
-          <w:p>
-            <w:r>
-              <w:t xml:space="preserve">e02, e2, wasserablauf, drain, not draining, ablauf, abpumpen, pumpe verstopft, pumpt nicht ab</w:t>
-            </w:r>
-          </w:p>
-        </w:tc>
-        <w:tc>
-          <w:tcPr>
-            <w:tcW w:w="2400" w:type="dxa"/>
-          </w:tcPr>
-          <w:p>
-            <w:r>
-              <w:t xml:space="preserve">Mixed EN/DE trigger words</w:t>
-            </w:r>
-          </w:p>
-        </w:tc>
-      </w:tr>
-      <w:tr>
-        <w:tc>
-          <w:tcPr>
-            <w:tcW w:w="2400" w:type="dxa"/>
-          </w:tcPr>
-          <w:p>
-            <w:r>
-              <w:t xml:space="preserve">Service claim lookup trigger terms</w:t>
-            </w:r>
-          </w:p>
-        </w:tc>
-        <w:tc>
-          <w:tcPr>
-            <w:tcW w:w="2400" w:type="dxa"/>
-          </w:tcPr>
-          <w:p>
-            <w:r>
-              <w:t xml:space="preserve">lookupEntries[4].triggerTerms</w:t>
-            </w:r>
-          </w:p>
-        </w:tc>
-        <w:tc>
-          <w:tcPr>
-            <w:tcW w:w="2400" w:type="dxa"/>
-          </w:tcPr>
-          <w:p>
-            <w:r>
-              <w:t xml:space="preserve">reset, restart, e1, e3, e4, e02</w:t>
-            </w:r>
-          </w:p>
-        </w:tc>
-        <w:tc>
-          <w:tcPr>
-            <w:tcW w:w="2400" w:type="dxa"/>
-          </w:tcPr>
-          <w:p>
-            <w:r>
-              <w:t xml:space="preserve">Mixed EN/DE trigger words</w:t>
-            </w:r>
-          </w:p>
-        </w:tc>
-      </w:tr>
-      <w:tr>
-        <w:tc>
-          <w:tcPr>
-            <w:tcW w:w="2400" w:type="dxa"/>
-          </w:tcPr>
-          <w:p>
-            <w:r>
-              <w:t xml:space="preserve">Service claim lookup trigger terms</w:t>
-            </w:r>
-          </w:p>
-        </w:tc>
-        <w:tc>
-          <w:tcPr>
-            <w:tcW w:w="2400" w:type="dxa"/>
-          </w:tcPr>
-          <w:p>
-            <w:r>
-              <w:t xml:space="preserve">lookupEntries[5].triggerTerms</w:t>
-            </w:r>
-          </w:p>
-        </w:tc>
-        <w:tc>
-          <w:tcPr>
-            <w:tcW w:w="2400" w:type="dxa"/>
-          </w:tcPr>
-          <w:p>
-            <w:r>
-              <w:t xml:space="preserve">e02, drain, not draining, ablauf, filter, temperature</w:t>
-            </w:r>
-          </w:p>
-        </w:tc>
-        <w:tc>
-          <w:tcPr>
-            <w:tcW w:w="2400" w:type="dxa"/>
-          </w:tcPr>
-          <w:p>
-            <w:r>
-              <w:t xml:space="preserve">Mixed EN/DE trigger words</w:t>
-            </w:r>
-          </w:p>
-        </w:tc>
-      </w:tr>
-      <w:tr>
-        <w:tc>
-          <w:tcPr>
-            <w:tcW w:w="2400" w:type="dxa"/>
-          </w:tcPr>
-          <w:p>
-            <w:r>
-              <w:t xml:space="preserve">Service claim lookup trigger terms</w:t>
-            </w:r>
-          </w:p>
-        </w:tc>
-        <w:tc>
-          <w:tcPr>
-            <w:tcW w:w="2400" w:type="dxa"/>
-          </w:tcPr>
-          <w:p>
-            <w:r>
-              <w:t xml:space="preserve">lookupEntries[6].triggerTerms</w:t>
-            </w:r>
-          </w:p>
-        </w:tc>
-        <w:tc>
-          <w:tcPr>
-            <w:tcW w:w="2400" w:type="dxa"/>
-          </w:tcPr>
-          <w:p>
-            <w:r>
-              <w:t xml:space="preserve">e4, base tray, bodenwanne, continuous pumping, pumpt dauerhaft</w:t>
-            </w:r>
-          </w:p>
-        </w:tc>
-        <w:tc>
-          <w:tcPr>
-            <w:tcW w:w="2400" w:type="dxa"/>
-          </w:tcPr>
-          <w:p>
-            <w:r>
-              <w:t xml:space="preserve">Mixed EN/DE trigger words</w:t>
             </w:r>
           </w:p>
         </w:tc>

</xml_diff>